<commit_message>
Improve internal link processing in ChatRasaView to handle special characters and short paths
</commit_message>
<xml_diff>
--- a/Hướng dẫn cài đặt chương trình.docx
+++ b/Hướng dẫn cài đặt chương trình.docx
@@ -44,72 +44,8 @@
           <w:rFonts w:ascii="Times New Roman" w:hAnsi="Times New Roman" w:cs="Times New Roman"/>
           <w:color w:val="auto"/>
         </w:rPr>
-        <w:t>1</w:t>
+        <w:t>1. Yêu cầu hệ thống</w:t>
       </w:r>
-      <w:r>
-        <w:rPr>
-          <w:rFonts w:ascii="Times New Roman" w:hAnsi="Times New Roman" w:cs="Times New Roman"/>
-          <w:color w:val="auto"/>
-        </w:rPr>
-        <w:t xml:space="preserve">. </w:t>
-      </w:r>
-      <w:proofErr w:type="spellStart"/>
-      <w:r>
-        <w:rPr>
-          <w:rFonts w:ascii="Times New Roman" w:hAnsi="Times New Roman" w:cs="Times New Roman"/>
-          <w:color w:val="auto"/>
-        </w:rPr>
-        <w:t>Yêu</w:t>
-      </w:r>
-      <w:proofErr w:type="spellEnd"/>
-      <w:r>
-        <w:rPr>
-          <w:rFonts w:ascii="Times New Roman" w:hAnsi="Times New Roman" w:cs="Times New Roman"/>
-          <w:color w:val="auto"/>
-        </w:rPr>
-        <w:t xml:space="preserve"> </w:t>
-      </w:r>
-      <w:proofErr w:type="spellStart"/>
-      <w:r>
-        <w:rPr>
-          <w:rFonts w:ascii="Times New Roman" w:hAnsi="Times New Roman" w:cs="Times New Roman"/>
-          <w:color w:val="auto"/>
-        </w:rPr>
-        <w:t>cầu</w:t>
-      </w:r>
-      <w:proofErr w:type="spellEnd"/>
-      <w:r>
-        <w:rPr>
-          <w:rFonts w:ascii="Times New Roman" w:hAnsi="Times New Roman" w:cs="Times New Roman"/>
-          <w:color w:val="auto"/>
-        </w:rPr>
-        <w:t xml:space="preserve"> </w:t>
-      </w:r>
-      <w:proofErr w:type="spellStart"/>
-      <w:r>
-        <w:rPr>
-          <w:rFonts w:ascii="Times New Roman" w:hAnsi="Times New Roman" w:cs="Times New Roman"/>
-          <w:color w:val="auto"/>
-        </w:rPr>
-        <w:t>hệ</w:t>
-      </w:r>
-      <w:proofErr w:type="spellEnd"/>
-      <w:r>
-        <w:rPr>
-          <w:rFonts w:ascii="Times New Roman" w:hAnsi="Times New Roman" w:cs="Times New Roman"/>
-          <w:color w:val="auto"/>
-        </w:rPr>
-        <w:t xml:space="preserve"> </w:t>
-      </w:r>
-      <w:proofErr w:type="spellStart"/>
-      <w:r>
-        <w:rPr>
-          <w:rFonts w:ascii="Times New Roman" w:hAnsi="Times New Roman" w:cs="Times New Roman"/>
-          <w:color w:val="auto"/>
-        </w:rPr>
-        <w:t>thống</w:t>
-      </w:r>
-      <w:proofErr w:type="spellEnd"/>
     </w:p>
     <w:p>
       <w:pPr>
@@ -152,27 +88,7 @@
           <w:szCs w:val="26"/>
         </w:rPr>
         <w:br/>
-        <w:t xml:space="preserve">- </w:t>
-      </w:r>
-      <w:proofErr w:type="spellStart"/>
-      <w:proofErr w:type="gramStart"/>
-      <w:r>
-        <w:rPr>
-          <w:rFonts w:cs="Times New Roman"/>
-          <w:sz w:val="26"/>
-          <w:szCs w:val="26"/>
-        </w:rPr>
-        <w:t>npm</w:t>
-      </w:r>
-      <w:proofErr w:type="spellEnd"/>
-      <w:proofErr w:type="gramEnd"/>
-      <w:r>
-        <w:rPr>
-          <w:rFonts w:cs="Times New Roman"/>
-          <w:sz w:val="26"/>
-          <w:szCs w:val="26"/>
-        </w:rPr>
-        <w:t xml:space="preserve"> &gt;= 8.x</w:t>
+        <w:t>- npm &gt;= 8.x</w:t>
       </w:r>
       <w:r>
         <w:rPr>
@@ -196,88 +112,8 @@
           <w:rFonts w:ascii="Times New Roman" w:hAnsi="Times New Roman" w:cs="Times New Roman"/>
           <w:color w:val="auto"/>
         </w:rPr>
-        <w:t>2</w:t>
+        <w:t>2. Cài đặt môi trường Python dùng chung</w:t>
       </w:r>
-      <w:r>
-        <w:rPr>
-          <w:rFonts w:ascii="Times New Roman" w:hAnsi="Times New Roman" w:cs="Times New Roman"/>
-          <w:color w:val="auto"/>
-        </w:rPr>
-        <w:t xml:space="preserve">. Cài </w:t>
-      </w:r>
-      <w:proofErr w:type="spellStart"/>
-      <w:r>
-        <w:rPr>
-          <w:rFonts w:ascii="Times New Roman" w:hAnsi="Times New Roman" w:cs="Times New Roman"/>
-          <w:color w:val="auto"/>
-        </w:rPr>
-        <w:t>đặt</w:t>
-      </w:r>
-      <w:proofErr w:type="spellEnd"/>
-      <w:r>
-        <w:rPr>
-          <w:rFonts w:ascii="Times New Roman" w:hAnsi="Times New Roman" w:cs="Times New Roman"/>
-          <w:color w:val="auto"/>
-        </w:rPr>
-        <w:t xml:space="preserve"> </w:t>
-      </w:r>
-      <w:proofErr w:type="spellStart"/>
-      <w:r>
-        <w:rPr>
-          <w:rFonts w:ascii="Times New Roman" w:hAnsi="Times New Roman" w:cs="Times New Roman"/>
-          <w:color w:val="auto"/>
-        </w:rPr>
-        <w:t>môi</w:t>
-      </w:r>
-      <w:proofErr w:type="spellEnd"/>
-      <w:r>
-        <w:rPr>
-          <w:rFonts w:ascii="Times New Roman" w:hAnsi="Times New Roman" w:cs="Times New Roman"/>
-          <w:color w:val="auto"/>
-        </w:rPr>
-        <w:t xml:space="preserve"> </w:t>
-      </w:r>
-      <w:proofErr w:type="spellStart"/>
-      <w:r>
-        <w:rPr>
-          <w:rFonts w:ascii="Times New Roman" w:hAnsi="Times New Roman" w:cs="Times New Roman"/>
-          <w:color w:val="auto"/>
-        </w:rPr>
-        <w:t>trường</w:t>
-      </w:r>
-      <w:proofErr w:type="spellEnd"/>
-      <w:r>
-        <w:rPr>
-          <w:rFonts w:ascii="Times New Roman" w:hAnsi="Times New Roman" w:cs="Times New Roman"/>
-          <w:color w:val="auto"/>
-        </w:rPr>
-        <w:t xml:space="preserve"> Python </w:t>
-      </w:r>
-      <w:proofErr w:type="spellStart"/>
-      <w:r>
-        <w:rPr>
-          <w:rFonts w:ascii="Times New Roman" w:hAnsi="Times New Roman" w:cs="Times New Roman"/>
-          <w:color w:val="auto"/>
-        </w:rPr>
-        <w:t>dùng</w:t>
-      </w:r>
-      <w:proofErr w:type="spellEnd"/>
-      <w:r>
-        <w:rPr>
-          <w:rFonts w:ascii="Times New Roman" w:hAnsi="Times New Roman" w:cs="Times New Roman"/>
-          <w:color w:val="auto"/>
-        </w:rPr>
-        <w:t xml:space="preserve"> </w:t>
-      </w:r>
-      <w:proofErr w:type="spellStart"/>
-      <w:r>
-        <w:rPr>
-          <w:rFonts w:ascii="Times New Roman" w:hAnsi="Times New Roman" w:cs="Times New Roman"/>
-          <w:color w:val="auto"/>
-        </w:rPr>
-        <w:t>chung</w:t>
-      </w:r>
-      <w:proofErr w:type="spellEnd"/>
     </w:p>
     <w:p>
       <w:pPr>
@@ -287,114 +123,6 @@
           <w:szCs w:val="26"/>
         </w:rPr>
       </w:pPr>
-      <w:r>
-        <w:rPr>
-          <w:rFonts w:cs="Times New Roman"/>
-          <w:sz w:val="26"/>
-          <w:szCs w:val="26"/>
-        </w:rPr>
-        <w:br/>
-      </w:r>
-      <w:proofErr w:type="spellStart"/>
-      <w:r>
-        <w:rPr>
-          <w:rFonts w:cs="Times New Roman"/>
-          <w:sz w:val="26"/>
-          <w:szCs w:val="26"/>
-        </w:rPr>
-        <w:t>Bước</w:t>
-      </w:r>
-      <w:proofErr w:type="spellEnd"/>
-      <w:r>
-        <w:rPr>
-          <w:rFonts w:cs="Times New Roman"/>
-          <w:sz w:val="26"/>
-          <w:szCs w:val="26"/>
-        </w:rPr>
-        <w:t xml:space="preserve"> 1: </w:t>
-      </w:r>
-      <w:proofErr w:type="spellStart"/>
-      <w:r>
-        <w:rPr>
-          <w:rFonts w:cs="Times New Roman"/>
-          <w:sz w:val="26"/>
-          <w:szCs w:val="26"/>
-        </w:rPr>
-        <w:t>Tạo</w:t>
-      </w:r>
-      <w:proofErr w:type="spellEnd"/>
-      <w:r>
-        <w:rPr>
-          <w:rFonts w:cs="Times New Roman"/>
-          <w:sz w:val="26"/>
-          <w:szCs w:val="26"/>
-        </w:rPr>
-        <w:t xml:space="preserve"> </w:t>
-      </w:r>
-      <w:proofErr w:type="spellStart"/>
-      <w:r>
-        <w:rPr>
-          <w:rFonts w:cs="Times New Roman"/>
-          <w:sz w:val="26"/>
-          <w:szCs w:val="26"/>
-        </w:rPr>
-        <w:t>môi</w:t>
-      </w:r>
-      <w:proofErr w:type="spellEnd"/>
-      <w:r>
-        <w:rPr>
-          <w:rFonts w:cs="Times New Roman"/>
-          <w:sz w:val="26"/>
-          <w:szCs w:val="26"/>
-        </w:rPr>
-        <w:t xml:space="preserve"> </w:t>
-      </w:r>
-      <w:proofErr w:type="spellStart"/>
-      <w:r>
-        <w:rPr>
-          <w:rFonts w:cs="Times New Roman"/>
-          <w:sz w:val="26"/>
-          <w:szCs w:val="26"/>
-        </w:rPr>
-        <w:t>trường</w:t>
-      </w:r>
-      <w:proofErr w:type="spellEnd"/>
-      <w:r>
-        <w:rPr>
-          <w:rFonts w:cs="Times New Roman"/>
-          <w:sz w:val="26"/>
-          <w:szCs w:val="26"/>
-        </w:rPr>
-        <w:t xml:space="preserve"> </w:t>
-      </w:r>
-      <w:proofErr w:type="spellStart"/>
-      <w:r>
-        <w:rPr>
-          <w:rFonts w:cs="Times New Roman"/>
-          <w:sz w:val="26"/>
-          <w:szCs w:val="26"/>
-        </w:rPr>
-        <w:t>ảo</w:t>
-      </w:r>
-      <w:proofErr w:type="spellEnd"/>
-      <w:r>
-        <w:rPr>
-          <w:rFonts w:cs="Times New Roman"/>
-          <w:sz w:val="26"/>
-          <w:szCs w:val="26"/>
-        </w:rPr>
-        <w:t xml:space="preserve"> </w:t>
-      </w:r>
-      <w:proofErr w:type="spellStart"/>
-      <w:r>
-        <w:rPr>
-          <w:rFonts w:cs="Times New Roman"/>
-          <w:sz w:val="26"/>
-          <w:szCs w:val="26"/>
-        </w:rPr>
-        <w:t>venv</w:t>
-      </w:r>
-      <w:proofErr w:type="spellEnd"/>
       <w:r>
         <w:rPr>
           <w:rFonts w:cs="Times New Roman"/>
@@ -409,36 +137,8 @@
           <w:sz w:val="26"/>
           <w:szCs w:val="26"/>
         </w:rPr>
-        <w:t xml:space="preserve">python3.10 -m </w:t>
+        <w:t>Bước 1: Tạo môi trường ảo venv</w:t>
       </w:r>
-      <w:proofErr w:type="spellStart"/>
-      <w:r>
-        <w:rPr>
-          <w:rFonts w:cs="Times New Roman"/>
-          <w:sz w:val="26"/>
-          <w:szCs w:val="26"/>
-        </w:rPr>
-        <w:t>venv</w:t>
-      </w:r>
-      <w:proofErr w:type="spellEnd"/>
-      <w:r>
-        <w:rPr>
-          <w:rFonts w:cs="Times New Roman"/>
-          <w:sz w:val="26"/>
-          <w:szCs w:val="26"/>
-        </w:rPr>
-        <w:t xml:space="preserve"> </w:t>
-      </w:r>
-      <w:proofErr w:type="spellStart"/>
-      <w:r>
-        <w:rPr>
-          <w:rFonts w:cs="Times New Roman"/>
-          <w:sz w:val="26"/>
-          <w:szCs w:val="26"/>
-        </w:rPr>
-        <w:t>venv</w:t>
-      </w:r>
-      <w:proofErr w:type="spellEnd"/>
       <w:r>
         <w:rPr>
           <w:rFonts w:cs="Times New Roman"/>
@@ -453,170 +153,7 @@
           <w:sz w:val="26"/>
           <w:szCs w:val="26"/>
         </w:rPr>
-        <w:br/>
-      </w:r>
-      <w:proofErr w:type="spellStart"/>
-      <w:r>
-        <w:rPr>
-          <w:rFonts w:cs="Times New Roman"/>
-          <w:sz w:val="26"/>
-          <w:szCs w:val="26"/>
-        </w:rPr>
-        <w:t>Bước</w:t>
-      </w:r>
-      <w:proofErr w:type="spellEnd"/>
-      <w:r>
-        <w:rPr>
-          <w:rFonts w:cs="Times New Roman"/>
-          <w:sz w:val="26"/>
-          <w:szCs w:val="26"/>
-        </w:rPr>
-        <w:t xml:space="preserve"> 2: </w:t>
-      </w:r>
-      <w:proofErr w:type="spellStart"/>
-      <w:r>
-        <w:rPr>
-          <w:rFonts w:cs="Times New Roman"/>
-          <w:sz w:val="26"/>
-          <w:szCs w:val="26"/>
-        </w:rPr>
-        <w:t>Kích</w:t>
-      </w:r>
-      <w:proofErr w:type="spellEnd"/>
-      <w:r>
-        <w:rPr>
-          <w:rFonts w:cs="Times New Roman"/>
-          <w:sz w:val="26"/>
-          <w:szCs w:val="26"/>
-        </w:rPr>
-        <w:t xml:space="preserve"> </w:t>
-      </w:r>
-      <w:proofErr w:type="spellStart"/>
-      <w:r>
-        <w:rPr>
-          <w:rFonts w:cs="Times New Roman"/>
-          <w:sz w:val="26"/>
-          <w:szCs w:val="26"/>
-        </w:rPr>
-        <w:t>hoạt</w:t>
-      </w:r>
-      <w:proofErr w:type="spellEnd"/>
-      <w:r>
-        <w:rPr>
-          <w:rFonts w:cs="Times New Roman"/>
-          <w:sz w:val="26"/>
-          <w:szCs w:val="26"/>
-        </w:rPr>
-        <w:t xml:space="preserve"> </w:t>
-      </w:r>
-      <w:proofErr w:type="spellStart"/>
-      <w:r>
-        <w:rPr>
-          <w:rFonts w:cs="Times New Roman"/>
-          <w:sz w:val="26"/>
-          <w:szCs w:val="26"/>
-        </w:rPr>
-        <w:t>môi</w:t>
-      </w:r>
-      <w:proofErr w:type="spellEnd"/>
-      <w:r>
-        <w:rPr>
-          <w:rFonts w:cs="Times New Roman"/>
-          <w:sz w:val="26"/>
-          <w:szCs w:val="26"/>
-        </w:rPr>
-        <w:t xml:space="preserve"> </w:t>
-      </w:r>
-      <w:proofErr w:type="spellStart"/>
-      <w:r>
-        <w:rPr>
-          <w:rFonts w:cs="Times New Roman"/>
-          <w:sz w:val="26"/>
-          <w:szCs w:val="26"/>
-        </w:rPr>
-        <w:t>trường</w:t>
-      </w:r>
-      <w:proofErr w:type="spellEnd"/>
-      <w:r>
-        <w:rPr>
-          <w:rFonts w:cs="Times New Roman"/>
-          <w:sz w:val="26"/>
-          <w:szCs w:val="26"/>
-        </w:rPr>
-        <w:t xml:space="preserve"> </w:t>
-      </w:r>
-      <w:proofErr w:type="spellStart"/>
-      <w:r>
-        <w:rPr>
-          <w:rFonts w:cs="Times New Roman"/>
-          <w:sz w:val="26"/>
-          <w:szCs w:val="26"/>
-        </w:rPr>
-        <w:t>ảo</w:t>
-      </w:r>
-      <w:proofErr w:type="spellEnd"/>
-      <w:r>
-        <w:rPr>
-          <w:rFonts w:cs="Times New Roman"/>
-          <w:sz w:val="26"/>
-          <w:szCs w:val="26"/>
-        </w:rPr>
-        <w:br/>
-        <w:t xml:space="preserve">source </w:t>
-      </w:r>
-      <w:proofErr w:type="spellStart"/>
-      <w:r>
-        <w:rPr>
-          <w:rFonts w:cs="Times New Roman"/>
-          <w:sz w:val="26"/>
-          <w:szCs w:val="26"/>
-        </w:rPr>
-        <w:t>venv</w:t>
-      </w:r>
-      <w:proofErr w:type="spellEnd"/>
-      <w:r>
-        <w:rPr>
-          <w:rFonts w:cs="Times New Roman"/>
-          <w:sz w:val="26"/>
-          <w:szCs w:val="26"/>
-        </w:rPr>
-        <w:t xml:space="preserve">/bin/activate         # </w:t>
-      </w:r>
-      <w:proofErr w:type="spellStart"/>
-      <w:r>
-        <w:rPr>
-          <w:rFonts w:cs="Times New Roman"/>
-          <w:sz w:val="26"/>
-          <w:szCs w:val="26"/>
-        </w:rPr>
-        <w:t>Trên</w:t>
-      </w:r>
-      <w:proofErr w:type="spellEnd"/>
-      <w:r>
-        <w:rPr>
-          <w:rFonts w:cs="Times New Roman"/>
-          <w:sz w:val="26"/>
-          <w:szCs w:val="26"/>
-        </w:rPr>
-        <w:t xml:space="preserve"> Windows: </w:t>
-      </w:r>
-      <w:proofErr w:type="spellStart"/>
-      <w:r>
-        <w:rPr>
-          <w:rFonts w:cs="Times New Roman"/>
-          <w:sz w:val="26"/>
-          <w:szCs w:val="26"/>
-        </w:rPr>
-        <w:t>venv</w:t>
-      </w:r>
-      <w:proofErr w:type="spellEnd"/>
-      <w:r>
-        <w:rPr>
-          <w:rFonts w:cs="Times New Roman"/>
-          <w:sz w:val="26"/>
-          <w:szCs w:val="26"/>
-        </w:rPr>
-        <w:t>\Scripts\activate</w:t>
+        <w:t>python3.10 -m venv venv</w:t>
       </w:r>
       <w:r>
         <w:rPr>
@@ -634,23 +171,13 @@
         </w:rPr>
         <w:br/>
       </w:r>
-      <w:proofErr w:type="spellStart"/>
       <w:r>
         <w:rPr>
           <w:rFonts w:cs="Times New Roman"/>
           <w:sz w:val="26"/>
           <w:szCs w:val="26"/>
         </w:rPr>
-        <w:t>Bước</w:t>
-      </w:r>
-      <w:proofErr w:type="spellEnd"/>
-      <w:r>
-        <w:rPr>
-          <w:rFonts w:cs="Times New Roman"/>
-          <w:sz w:val="26"/>
-          <w:szCs w:val="26"/>
-        </w:rPr>
-        <w:t xml:space="preserve"> 3: </w:t>
+        <w:t>Bước 2: Kích hoạt môi trường ảo</w:t>
       </w:r>
       <w:r>
         <w:rPr>
@@ -658,43 +185,8 @@
           <w:sz w:val="26"/>
           <w:szCs w:val="26"/>
         </w:rPr>
-        <w:t xml:space="preserve"> Cài requirements </w:t>
-      </w:r>
-      <w:proofErr w:type="spellStart"/>
-      <w:r>
-        <w:rPr>
-          <w:rFonts w:cs="Times New Roman"/>
-          <w:sz w:val="26"/>
-          <w:szCs w:val="26"/>
-        </w:rPr>
-        <w:t>riêng</w:t>
-      </w:r>
-      <w:proofErr w:type="spellEnd"/>
-      <w:r>
-        <w:rPr>
-          <w:rFonts w:cs="Times New Roman"/>
-          <w:sz w:val="26"/>
-          <w:szCs w:val="26"/>
-        </w:rPr>
-        <w:t xml:space="preserve"> </w:t>
-      </w:r>
-      <w:proofErr w:type="spellStart"/>
-      <w:r>
-        <w:rPr>
-          <w:rFonts w:cs="Times New Roman"/>
-          <w:sz w:val="26"/>
-          <w:szCs w:val="26"/>
-        </w:rPr>
-        <w:t>cho</w:t>
-      </w:r>
-      <w:proofErr w:type="spellEnd"/>
-      <w:r>
-        <w:rPr>
-          <w:rFonts w:cs="Times New Roman"/>
-          <w:sz w:val="26"/>
-          <w:szCs w:val="26"/>
-        </w:rPr>
-        <w:t xml:space="preserve"> </w:t>
+        <w:br/>
+        <w:t>source venv/bin/activate         # Trên Windows: venv\Scripts\activate</w:t>
       </w:r>
       <w:r>
         <w:rPr>
@@ -702,25 +194,39 @@
           <w:sz w:val="26"/>
           <w:szCs w:val="26"/>
         </w:rPr>
-        <w:t xml:space="preserve">backend </w:t>
+        <w:br/>
       </w:r>
-      <w:proofErr w:type="spellStart"/>
       <w:r>
         <w:rPr>
           <w:rFonts w:cs="Times New Roman"/>
           <w:sz w:val="26"/>
           <w:szCs w:val="26"/>
         </w:rPr>
-        <w:t>và</w:t>
+        <w:br/>
       </w:r>
-      <w:proofErr w:type="spellEnd"/>
       <w:r>
         <w:rPr>
           <w:rFonts w:cs="Times New Roman"/>
           <w:sz w:val="26"/>
           <w:szCs w:val="26"/>
         </w:rPr>
-        <w:t xml:space="preserve"> chatbot rasa</w:t>
+        <w:t xml:space="preserve">Bước 3: </w:t>
+      </w:r>
+      <w:r>
+        <w:rPr>
+          <w:rFonts w:cs="Times New Roman"/>
+          <w:sz w:val="26"/>
+          <w:szCs w:val="26"/>
+        </w:rPr>
+        <w:t xml:space="preserve"> Cài requirements riêng cho </w:t>
+      </w:r>
+      <w:r>
+        <w:rPr>
+          <w:rFonts w:cs="Times New Roman"/>
+          <w:sz w:val="26"/>
+          <w:szCs w:val="26"/>
+        </w:rPr>
+        <w:t>backend và chatbot rasa</w:t>
       </w:r>
       <w:r>
         <w:rPr>
@@ -738,25 +244,7 @@
           <w:szCs w:val="26"/>
         </w:rPr>
         <w:br/>
-        <w:t xml:space="preserve">pip install -r </w:t>
-      </w:r>
-      <w:proofErr w:type="spellStart"/>
-      <w:r>
-        <w:rPr>
-          <w:rFonts w:cs="Times New Roman"/>
-          <w:sz w:val="26"/>
-          <w:szCs w:val="26"/>
-        </w:rPr>
-        <w:t>Rasa_Chatbot</w:t>
-      </w:r>
-      <w:proofErr w:type="spellEnd"/>
-      <w:r>
-        <w:rPr>
-          <w:rFonts w:cs="Times New Roman"/>
-          <w:sz w:val="26"/>
-          <w:szCs w:val="26"/>
-        </w:rPr>
-        <w:t>/requirements.txt</w:t>
+        <w:t>pip install -r Rasa_Chatbot/requirements.txt</w:t>
       </w:r>
       <w:r>
         <w:rPr>
@@ -780,30 +268,7 @@
           <w:rFonts w:ascii="Times New Roman" w:hAnsi="Times New Roman" w:cs="Times New Roman"/>
           <w:color w:val="auto"/>
         </w:rPr>
-        <w:t>3</w:t>
-      </w:r>
-      <w:r>
-        <w:rPr>
-          <w:rFonts w:ascii="Times New Roman" w:hAnsi="Times New Roman" w:cs="Times New Roman"/>
-          <w:color w:val="auto"/>
-        </w:rPr>
-        <w:t xml:space="preserve">. Cài </w:t>
-      </w:r>
-      <w:proofErr w:type="spellStart"/>
-      <w:r>
-        <w:rPr>
-          <w:rFonts w:ascii="Times New Roman" w:hAnsi="Times New Roman" w:cs="Times New Roman"/>
-          <w:color w:val="auto"/>
-        </w:rPr>
-        <w:t>đặt</w:t>
-      </w:r>
-      <w:proofErr w:type="spellEnd"/>
-      <w:r>
-        <w:rPr>
-          <w:rFonts w:ascii="Times New Roman" w:hAnsi="Times New Roman" w:cs="Times New Roman"/>
-          <w:color w:val="auto"/>
-        </w:rPr>
-        <w:t xml:space="preserve"> frontend (Vue.js)</w:t>
+        <w:t>3. Cài đặt frontend (Vue.js)</w:t>
       </w:r>
     </w:p>
     <w:p>
@@ -830,24 +295,7 @@
           <w:szCs w:val="26"/>
         </w:rPr>
         <w:br/>
-      </w:r>
-      <w:proofErr w:type="spellStart"/>
-      <w:r>
-        <w:rPr>
-          <w:rFonts w:cs="Times New Roman"/>
-          <w:sz w:val="26"/>
-          <w:szCs w:val="26"/>
-        </w:rPr>
-        <w:t>npm</w:t>
-      </w:r>
-      <w:proofErr w:type="spellEnd"/>
-      <w:r>
-        <w:rPr>
-          <w:rFonts w:cs="Times New Roman"/>
-          <w:sz w:val="26"/>
-          <w:szCs w:val="26"/>
-        </w:rPr>
-        <w:t xml:space="preserve"> install</w:t>
+        <w:t>npm install</w:t>
       </w:r>
       <w:r>
         <w:rPr>
@@ -864,72 +312,8 @@
           <w:szCs w:val="26"/>
         </w:rPr>
         <w:br/>
-        <w:t xml:space="preserve"># </w:t>
+        <w:t># Tạo file .env nếu chưa có</w:t>
       </w:r>
-      <w:proofErr w:type="spellStart"/>
-      <w:r>
-        <w:rPr>
-          <w:rFonts w:cs="Times New Roman"/>
-          <w:sz w:val="26"/>
-          <w:szCs w:val="26"/>
-        </w:rPr>
-        <w:t>Tạo</w:t>
-      </w:r>
-      <w:proofErr w:type="spellEnd"/>
-      <w:r>
-        <w:rPr>
-          <w:rFonts w:cs="Times New Roman"/>
-          <w:sz w:val="26"/>
-          <w:szCs w:val="26"/>
-        </w:rPr>
-        <w:t xml:space="preserve"> file .env </w:t>
-      </w:r>
-      <w:proofErr w:type="spellStart"/>
-      <w:r>
-        <w:rPr>
-          <w:rFonts w:cs="Times New Roman"/>
-          <w:sz w:val="26"/>
-          <w:szCs w:val="26"/>
-        </w:rPr>
-        <w:t>nếu</w:t>
-      </w:r>
-      <w:proofErr w:type="spellEnd"/>
-      <w:r>
-        <w:rPr>
-          <w:rFonts w:cs="Times New Roman"/>
-          <w:sz w:val="26"/>
-          <w:szCs w:val="26"/>
-        </w:rPr>
-        <w:t xml:space="preserve"> </w:t>
-      </w:r>
-      <w:proofErr w:type="spellStart"/>
-      <w:r>
-        <w:rPr>
-          <w:rFonts w:cs="Times New Roman"/>
-          <w:sz w:val="26"/>
-          <w:szCs w:val="26"/>
-        </w:rPr>
-        <w:t>chưa</w:t>
-      </w:r>
-      <w:proofErr w:type="spellEnd"/>
-      <w:r>
-        <w:rPr>
-          <w:rFonts w:cs="Times New Roman"/>
-          <w:sz w:val="26"/>
-          <w:szCs w:val="26"/>
-        </w:rPr>
-        <w:t xml:space="preserve"> </w:t>
-      </w:r>
-      <w:proofErr w:type="spellStart"/>
-      <w:r>
-        <w:rPr>
-          <w:rFonts w:cs="Times New Roman"/>
-          <w:sz w:val="26"/>
-          <w:szCs w:val="26"/>
-        </w:rPr>
-        <w:t>có</w:t>
-      </w:r>
-      <w:proofErr w:type="spellEnd"/>
       <w:r>
         <w:rPr>
           <w:rFonts w:cs="Times New Roman"/>
@@ -961,56 +345,8 @@
           <w:rFonts w:ascii="Times New Roman" w:hAnsi="Times New Roman" w:cs="Times New Roman"/>
           <w:color w:val="auto"/>
         </w:rPr>
-        <w:t>4</w:t>
+        <w:t>4. Chạy hệ thống</w:t>
       </w:r>
-      <w:r>
-        <w:rPr>
-          <w:rFonts w:ascii="Times New Roman" w:hAnsi="Times New Roman" w:cs="Times New Roman"/>
-          <w:color w:val="auto"/>
-        </w:rPr>
-        <w:t xml:space="preserve">. </w:t>
-      </w:r>
-      <w:proofErr w:type="spellStart"/>
-      <w:r>
-        <w:rPr>
-          <w:rFonts w:ascii="Times New Roman" w:hAnsi="Times New Roman" w:cs="Times New Roman"/>
-          <w:color w:val="auto"/>
-        </w:rPr>
-        <w:t>Chạy</w:t>
-      </w:r>
-      <w:proofErr w:type="spellEnd"/>
-      <w:r>
-        <w:rPr>
-          <w:rFonts w:ascii="Times New Roman" w:hAnsi="Times New Roman" w:cs="Times New Roman"/>
-          <w:color w:val="auto"/>
-        </w:rPr>
-        <w:t xml:space="preserve"> </w:t>
-      </w:r>
-      <w:proofErr w:type="spellStart"/>
-      <w:r>
-        <w:rPr>
-          <w:rFonts w:ascii="Times New Roman" w:hAnsi="Times New Roman" w:cs="Times New Roman"/>
-          <w:color w:val="auto"/>
-        </w:rPr>
-        <w:t>hệ</w:t>
-      </w:r>
-      <w:proofErr w:type="spellEnd"/>
-      <w:r>
-        <w:rPr>
-          <w:rFonts w:ascii="Times New Roman" w:hAnsi="Times New Roman" w:cs="Times New Roman"/>
-          <w:color w:val="auto"/>
-        </w:rPr>
-        <w:t xml:space="preserve"> </w:t>
-      </w:r>
-      <w:proofErr w:type="spellStart"/>
-      <w:r>
-        <w:rPr>
-          <w:rFonts w:ascii="Times New Roman" w:hAnsi="Times New Roman" w:cs="Times New Roman"/>
-          <w:color w:val="auto"/>
-        </w:rPr>
-        <w:t>thống</w:t>
-      </w:r>
-      <w:proofErr w:type="spellEnd"/>
     </w:p>
     <w:p>
       <w:pPr>
@@ -1029,28 +365,8 @@
           <w:sz w:val="26"/>
           <w:szCs w:val="26"/>
         </w:rPr>
-        <w:t>4</w:t>
+        <w:t>4.1 Backend - FastAPI</w:t>
       </w:r>
-      <w:r>
-        <w:rPr>
-          <w:rFonts w:ascii="Times New Roman" w:hAnsi="Times New Roman" w:cs="Times New Roman"/>
-          <w:color w:val="auto"/>
-          <w:sz w:val="26"/>
-          <w:szCs w:val="26"/>
-        </w:rPr>
-        <w:t xml:space="preserve">.1 Backend - </w:t>
-      </w:r>
-      <w:proofErr w:type="spellStart"/>
-      <w:r>
-        <w:rPr>
-          <w:rFonts w:ascii="Times New Roman" w:hAnsi="Times New Roman" w:cs="Times New Roman"/>
-          <w:color w:val="auto"/>
-          <w:sz w:val="26"/>
-          <w:szCs w:val="26"/>
-        </w:rPr>
-        <w:t>FastAPI</w:t>
-      </w:r>
-      <w:proofErr w:type="spellEnd"/>
     </w:p>
     <w:p>
       <w:pPr>
@@ -1067,25 +383,7 @@
           <w:szCs w:val="26"/>
         </w:rPr>
         <w:br/>
-        <w:t xml:space="preserve">source </w:t>
-      </w:r>
-      <w:proofErr w:type="spellStart"/>
-      <w:r>
-        <w:rPr>
-          <w:rFonts w:cs="Times New Roman"/>
-          <w:sz w:val="26"/>
-          <w:szCs w:val="26"/>
-        </w:rPr>
-        <w:t>venv</w:t>
-      </w:r>
-      <w:proofErr w:type="spellEnd"/>
-      <w:r>
-        <w:rPr>
-          <w:rFonts w:cs="Times New Roman"/>
-          <w:sz w:val="26"/>
-          <w:szCs w:val="26"/>
-        </w:rPr>
-        <w:t>/bin/activate</w:t>
+        <w:t>source venv/bin/activate</w:t>
       </w:r>
       <w:r>
         <w:rPr>
@@ -1104,7 +402,6 @@
         </w:rPr>
         <w:br/>
       </w:r>
-      <w:proofErr w:type="spellStart"/>
       <w:r>
         <w:rPr>
           <w:rFonts w:cs="Times New Roman"/>
@@ -1112,34 +409,7 @@
           <w:szCs w:val="26"/>
         </w:rPr>
         <w:lastRenderedPageBreak/>
-        <w:t>uvicorn</w:t>
-      </w:r>
-      <w:proofErr w:type="spellEnd"/>
-      <w:r>
-        <w:rPr>
-          <w:rFonts w:cs="Times New Roman"/>
-          <w:sz w:val="26"/>
-          <w:szCs w:val="26"/>
-        </w:rPr>
-        <w:t xml:space="preserve"> </w:t>
-      </w:r>
-      <w:proofErr w:type="spellStart"/>
-      <w:r>
-        <w:rPr>
-          <w:rFonts w:cs="Times New Roman"/>
-          <w:sz w:val="26"/>
-          <w:szCs w:val="26"/>
-        </w:rPr>
-        <w:t>main:app</w:t>
-      </w:r>
-      <w:proofErr w:type="spellEnd"/>
-      <w:r>
-        <w:rPr>
-          <w:rFonts w:cs="Times New Roman"/>
-          <w:sz w:val="26"/>
-          <w:szCs w:val="26"/>
-        </w:rPr>
-        <w:t xml:space="preserve"> --reload --host 0.0.0.0 --port 8000</w:t>
+        <w:t>uvicorn main:app --reload --host 0.0.0.0 --port 8000</w:t>
       </w:r>
       <w:r>
         <w:rPr>
@@ -1167,16 +437,7 @@
           <w:sz w:val="26"/>
           <w:szCs w:val="26"/>
         </w:rPr>
-        <w:t>4</w:t>
-      </w:r>
-      <w:r>
-        <w:rPr>
-          <w:rFonts w:ascii="Times New Roman" w:hAnsi="Times New Roman" w:cs="Times New Roman"/>
-          <w:color w:val="auto"/>
-          <w:sz w:val="26"/>
-          <w:szCs w:val="26"/>
-        </w:rPr>
-        <w:t>.2 Frontend - Vue.js</w:t>
+        <w:t>4.2 Frontend - Vue.js</w:t>
       </w:r>
     </w:p>
     <w:p>
@@ -1203,24 +464,7 @@
           <w:szCs w:val="26"/>
         </w:rPr>
         <w:br/>
-      </w:r>
-      <w:proofErr w:type="spellStart"/>
-      <w:r>
-        <w:rPr>
-          <w:rFonts w:cs="Times New Roman"/>
-          <w:sz w:val="26"/>
-          <w:szCs w:val="26"/>
-        </w:rPr>
-        <w:t>npm</w:t>
-      </w:r>
-      <w:proofErr w:type="spellEnd"/>
-      <w:r>
-        <w:rPr>
-          <w:rFonts w:cs="Times New Roman"/>
-          <w:sz w:val="26"/>
-          <w:szCs w:val="26"/>
-        </w:rPr>
-        <w:t xml:space="preserve"> run serve</w:t>
+        <w:t>npm run serve</w:t>
       </w:r>
       <w:r>
         <w:rPr>
@@ -1237,61 +481,7 @@
           <w:szCs w:val="26"/>
         </w:rPr>
         <w:br/>
-        <w:t xml:space="preserve"># </w:t>
-      </w:r>
-      <w:proofErr w:type="spellStart"/>
-      <w:r>
-        <w:rPr>
-          <w:rFonts w:cs="Times New Roman"/>
-          <w:sz w:val="26"/>
-          <w:szCs w:val="26"/>
-        </w:rPr>
-        <w:t>Truy</w:t>
-      </w:r>
-      <w:proofErr w:type="spellEnd"/>
-      <w:r>
-        <w:rPr>
-          <w:rFonts w:cs="Times New Roman"/>
-          <w:sz w:val="26"/>
-          <w:szCs w:val="26"/>
-        </w:rPr>
-        <w:t xml:space="preserve"> </w:t>
-      </w:r>
-      <w:proofErr w:type="spellStart"/>
-      <w:r>
-        <w:rPr>
-          <w:rFonts w:cs="Times New Roman"/>
-          <w:sz w:val="26"/>
-          <w:szCs w:val="26"/>
-        </w:rPr>
-        <w:t>cập</w:t>
-      </w:r>
-      <w:proofErr w:type="spellEnd"/>
-      <w:r>
-        <w:rPr>
-          <w:rFonts w:cs="Times New Roman"/>
-          <w:sz w:val="26"/>
-          <w:szCs w:val="26"/>
-        </w:rPr>
-        <w:t xml:space="preserve"> </w:t>
-      </w:r>
-      <w:proofErr w:type="spellStart"/>
-      <w:r>
-        <w:rPr>
-          <w:rFonts w:cs="Times New Roman"/>
-          <w:sz w:val="26"/>
-          <w:szCs w:val="26"/>
-        </w:rPr>
-        <w:t>tại</w:t>
-      </w:r>
-      <w:proofErr w:type="spellEnd"/>
-      <w:r>
-        <w:rPr>
-          <w:rFonts w:cs="Times New Roman"/>
-          <w:sz w:val="26"/>
-          <w:szCs w:val="26"/>
-        </w:rPr>
-        <w:t>: http://localhost:8080</w:t>
+        <w:t># Truy cập tại: http://localhost:8080</w:t>
       </w:r>
       <w:r>
         <w:rPr>
@@ -1319,8 +509,19 @@
           <w:sz w:val="26"/>
           <w:szCs w:val="26"/>
         </w:rPr>
-        <w:t>4</w:t>
+        <w:t>4.3 Chatbot Rasa</w:t>
       </w:r>
+    </w:p>
+    <w:p>
+      <w:pPr>
+        <w:pStyle w:val="u4"/>
+        <w:rPr>
+          <w:rFonts w:ascii="Times New Roman" w:hAnsi="Times New Roman" w:cs="Times New Roman"/>
+          <w:color w:val="auto"/>
+          <w:sz w:val="26"/>
+          <w:szCs w:val="26"/>
+        </w:rPr>
+      </w:pPr>
       <w:r>
         <w:rPr>
           <w:rFonts w:ascii="Times New Roman" w:hAnsi="Times New Roman" w:cs="Times New Roman"/>
@@ -1328,135 +529,8 @@
           <w:sz w:val="26"/>
           <w:szCs w:val="26"/>
         </w:rPr>
-        <w:t>.3 Chatbot Rasa</w:t>
+        <w:t>4.3.1 Chạy Rasa Server với model lựa chọn</w:t>
       </w:r>
-    </w:p>
-    <w:p>
-      <w:pPr>
-        <w:pStyle w:val="u4"/>
-        <w:rPr>
-          <w:rFonts w:ascii="Times New Roman" w:hAnsi="Times New Roman" w:cs="Times New Roman"/>
-          <w:color w:val="auto"/>
-          <w:sz w:val="26"/>
-          <w:szCs w:val="26"/>
-        </w:rPr>
-      </w:pPr>
-      <w:r>
-        <w:rPr>
-          <w:rFonts w:ascii="Times New Roman" w:hAnsi="Times New Roman" w:cs="Times New Roman"/>
-          <w:color w:val="auto"/>
-          <w:sz w:val="26"/>
-          <w:szCs w:val="26"/>
-        </w:rPr>
-        <w:t>4</w:t>
-      </w:r>
-      <w:r>
-        <w:rPr>
-          <w:rFonts w:ascii="Times New Roman" w:hAnsi="Times New Roman" w:cs="Times New Roman"/>
-          <w:color w:val="auto"/>
-          <w:sz w:val="26"/>
-          <w:szCs w:val="26"/>
-        </w:rPr>
-        <w:t>.3.</w:t>
-      </w:r>
-      <w:r>
-        <w:rPr>
-          <w:rFonts w:ascii="Times New Roman" w:hAnsi="Times New Roman" w:cs="Times New Roman"/>
-          <w:color w:val="auto"/>
-          <w:sz w:val="26"/>
-          <w:szCs w:val="26"/>
-        </w:rPr>
-        <w:t>1</w:t>
-      </w:r>
-      <w:r>
-        <w:rPr>
-          <w:rFonts w:ascii="Times New Roman" w:hAnsi="Times New Roman" w:cs="Times New Roman"/>
-          <w:color w:val="auto"/>
-          <w:sz w:val="26"/>
-          <w:szCs w:val="26"/>
-        </w:rPr>
-        <w:t xml:space="preserve"> </w:t>
-      </w:r>
-      <w:proofErr w:type="spellStart"/>
-      <w:r>
-        <w:rPr>
-          <w:rFonts w:ascii="Times New Roman" w:hAnsi="Times New Roman" w:cs="Times New Roman"/>
-          <w:color w:val="auto"/>
-          <w:sz w:val="26"/>
-          <w:szCs w:val="26"/>
-        </w:rPr>
-        <w:t>Chạy</w:t>
-      </w:r>
-      <w:proofErr w:type="spellEnd"/>
-      <w:r>
-        <w:rPr>
-          <w:rFonts w:ascii="Times New Roman" w:hAnsi="Times New Roman" w:cs="Times New Roman"/>
-          <w:color w:val="auto"/>
-          <w:sz w:val="26"/>
-          <w:szCs w:val="26"/>
-        </w:rPr>
-        <w:t xml:space="preserve"> Rasa Server </w:t>
-      </w:r>
-      <w:proofErr w:type="spellStart"/>
-      <w:r>
-        <w:rPr>
-          <w:rFonts w:ascii="Times New Roman" w:hAnsi="Times New Roman" w:cs="Times New Roman"/>
-          <w:color w:val="auto"/>
-          <w:sz w:val="26"/>
-          <w:szCs w:val="26"/>
-        </w:rPr>
-        <w:t>với</w:t>
-      </w:r>
-      <w:proofErr w:type="spellEnd"/>
-      <w:r>
-        <w:rPr>
-          <w:rFonts w:ascii="Times New Roman" w:hAnsi="Times New Roman" w:cs="Times New Roman"/>
-          <w:color w:val="auto"/>
-          <w:sz w:val="26"/>
-          <w:szCs w:val="26"/>
-        </w:rPr>
-        <w:t xml:space="preserve"> model</w:t>
-      </w:r>
-      <w:r>
-        <w:rPr>
-          <w:rFonts w:ascii="Times New Roman" w:hAnsi="Times New Roman" w:cs="Times New Roman"/>
-          <w:color w:val="auto"/>
-          <w:sz w:val="26"/>
-          <w:szCs w:val="26"/>
-        </w:rPr>
-        <w:t xml:space="preserve"> </w:t>
-      </w:r>
-      <w:proofErr w:type="spellStart"/>
-      <w:r>
-        <w:rPr>
-          <w:rFonts w:ascii="Times New Roman" w:hAnsi="Times New Roman" w:cs="Times New Roman"/>
-          <w:color w:val="auto"/>
-          <w:sz w:val="26"/>
-          <w:szCs w:val="26"/>
-        </w:rPr>
-        <w:t>lựa</w:t>
-      </w:r>
-      <w:proofErr w:type="spellEnd"/>
-      <w:r>
-        <w:rPr>
-          <w:rFonts w:ascii="Times New Roman" w:hAnsi="Times New Roman" w:cs="Times New Roman"/>
-          <w:color w:val="auto"/>
-          <w:sz w:val="26"/>
-          <w:szCs w:val="26"/>
-        </w:rPr>
-        <w:t xml:space="preserve"> </w:t>
-      </w:r>
-      <w:proofErr w:type="spellStart"/>
-      <w:r>
-        <w:rPr>
-          <w:rFonts w:ascii="Times New Roman" w:hAnsi="Times New Roman" w:cs="Times New Roman"/>
-          <w:color w:val="auto"/>
-          <w:sz w:val="26"/>
-          <w:szCs w:val="26"/>
-        </w:rPr>
-        <w:t>chọn</w:t>
-      </w:r>
-      <w:proofErr w:type="spellEnd"/>
     </w:p>
     <w:p>
       <w:pPr>
@@ -1473,25 +547,7 @@
           <w:szCs w:val="26"/>
         </w:rPr>
         <w:br/>
-        <w:t xml:space="preserve">source </w:t>
-      </w:r>
-      <w:proofErr w:type="spellStart"/>
-      <w:r>
-        <w:rPr>
-          <w:rFonts w:cs="Times New Roman"/>
-          <w:sz w:val="26"/>
-          <w:szCs w:val="26"/>
-        </w:rPr>
-        <w:t>venv</w:t>
-      </w:r>
-      <w:proofErr w:type="spellEnd"/>
-      <w:r>
-        <w:rPr>
-          <w:rFonts w:cs="Times New Roman"/>
-          <w:sz w:val="26"/>
-          <w:szCs w:val="26"/>
-        </w:rPr>
-        <w:t>/bin/activate</w:t>
+        <w:t>source venv/bin/activate</w:t>
       </w:r>
       <w:r>
         <w:rPr>
@@ -1500,18 +556,8 @@
           <w:szCs w:val="26"/>
         </w:rPr>
         <w:br/>
-        <w:t xml:space="preserve">cd </w:t>
+        <w:t>cd Rasa_Chatbot</w:t>
       </w:r>
-      <w:proofErr w:type="spellStart"/>
-      <w:r>
-        <w:rPr>
-          <w:rFonts w:cs="Times New Roman"/>
-          <w:sz w:val="26"/>
-          <w:szCs w:val="26"/>
-        </w:rPr>
-        <w:t>Rasa_Chatbot</w:t>
-      </w:r>
-      <w:proofErr w:type="spellEnd"/>
       <w:r>
         <w:rPr>
           <w:rFonts w:cs="Times New Roman"/>
@@ -1528,25 +574,7 @@
           <w:szCs w:val="26"/>
         </w:rPr>
         <w:br/>
-        <w:t xml:space="preserve">  --enable-</w:t>
-      </w:r>
-      <w:proofErr w:type="spellStart"/>
-      <w:r>
-        <w:rPr>
-          <w:rFonts w:cs="Times New Roman"/>
-          <w:sz w:val="26"/>
-          <w:szCs w:val="26"/>
-        </w:rPr>
-        <w:t>api</w:t>
-      </w:r>
-      <w:proofErr w:type="spellEnd"/>
-      <w:r>
-        <w:rPr>
-          <w:rFonts w:cs="Times New Roman"/>
-          <w:sz w:val="26"/>
-          <w:szCs w:val="26"/>
-        </w:rPr>
-        <w:t xml:space="preserve"> \</w:t>
+        <w:t xml:space="preserve">  --enable-api \</w:t>
       </w:r>
       <w:r>
         <w:rPr>
@@ -1564,25 +592,7 @@
           <w:szCs w:val="26"/>
         </w:rPr>
         <w:br/>
-        <w:t xml:space="preserve">  --</w:t>
-      </w:r>
-      <w:proofErr w:type="spellStart"/>
-      <w:r>
-        <w:rPr>
-          <w:rFonts w:cs="Times New Roman"/>
-          <w:sz w:val="26"/>
-          <w:szCs w:val="26"/>
-        </w:rPr>
-        <w:t>cors</w:t>
-      </w:r>
-      <w:proofErr w:type="spellEnd"/>
-      <w:r>
-        <w:rPr>
-          <w:rFonts w:cs="Times New Roman"/>
-          <w:sz w:val="26"/>
-          <w:szCs w:val="26"/>
-        </w:rPr>
-        <w:t xml:space="preserve"> "*" \</w:t>
+        <w:t xml:space="preserve">  --cors "*" \</w:t>
       </w:r>
       <w:r>
         <w:rPr>
@@ -1611,48 +621,17 @@
           <w:sz w:val="26"/>
           <w:szCs w:val="26"/>
         </w:rPr>
-        <w:t>4.3.</w:t>
+        <w:t>4.3.2 Chạy Action Server</w:t>
       </w:r>
-      <w:r>
+    </w:p>
+    <w:p>
+      <w:pPr>
         <w:rPr>
-          <w:rFonts w:ascii="Times New Roman" w:hAnsi="Times New Roman" w:cs="Times New Roman"/>
-          <w:color w:val="auto"/>
+          <w:rFonts w:cs="Times New Roman"/>
           <w:sz w:val="26"/>
           <w:szCs w:val="26"/>
         </w:rPr>
-        <w:t>2</w:t>
-      </w:r>
-      <w:r>
-        <w:rPr>
-          <w:rFonts w:ascii="Times New Roman" w:hAnsi="Times New Roman" w:cs="Times New Roman"/>
-          <w:color w:val="auto"/>
-          <w:sz w:val="26"/>
-          <w:szCs w:val="26"/>
-        </w:rPr>
-        <w:t xml:space="preserve"> </w:t>
-      </w:r>
-      <w:proofErr w:type="spellStart"/>
-      <w:r>
-        <w:rPr>
-          <w:rFonts w:ascii="Times New Roman" w:hAnsi="Times New Roman" w:cs="Times New Roman"/>
-          <w:color w:val="auto"/>
-          <w:sz w:val="26"/>
-          <w:szCs w:val="26"/>
-        </w:rPr>
-        <w:t>Chạy</w:t>
-      </w:r>
-      <w:proofErr w:type="spellEnd"/>
-      <w:r>
-        <w:rPr>
-          <w:rFonts w:ascii="Times New Roman" w:hAnsi="Times New Roman" w:cs="Times New Roman"/>
-          <w:color w:val="auto"/>
-          <w:sz w:val="26"/>
-          <w:szCs w:val="26"/>
-        </w:rPr>
-        <w:t xml:space="preserve"> Action Server</w:t>
-      </w:r>
-    </w:p>
-    <w:p>
+      </w:pPr>
       <w:r>
         <w:rPr>
           <w:rFonts w:cs="Times New Roman"/>
@@ -1660,25 +639,7 @@
           <w:szCs w:val="26"/>
         </w:rPr>
         <w:br/>
-        <w:t xml:space="preserve">source </w:t>
-      </w:r>
-      <w:proofErr w:type="spellStart"/>
-      <w:r>
-        <w:rPr>
-          <w:rFonts w:cs="Times New Roman"/>
-          <w:sz w:val="26"/>
-          <w:szCs w:val="26"/>
-        </w:rPr>
-        <w:t>venv</w:t>
-      </w:r>
-      <w:proofErr w:type="spellEnd"/>
-      <w:r>
-        <w:rPr>
-          <w:rFonts w:cs="Times New Roman"/>
-          <w:sz w:val="26"/>
-          <w:szCs w:val="26"/>
-        </w:rPr>
-        <w:t>/bin/activate</w:t>
+        <w:t>source venv/bin/activate</w:t>
       </w:r>
       <w:r>
         <w:rPr>
@@ -1687,18 +648,8 @@
           <w:szCs w:val="26"/>
         </w:rPr>
         <w:br/>
-        <w:t xml:space="preserve">cd </w:t>
+        <w:t>cd Rasa_Chatbot</w:t>
       </w:r>
-      <w:proofErr w:type="spellStart"/>
-      <w:r>
-        <w:rPr>
-          <w:rFonts w:cs="Times New Roman"/>
-          <w:sz w:val="26"/>
-          <w:szCs w:val="26"/>
-        </w:rPr>
-        <w:t>Rasa_Chatbot</w:t>
-      </w:r>
-      <w:proofErr w:type="spellEnd"/>
       <w:r>
         <w:rPr>
           <w:rFonts w:cs="Times New Roman"/>
@@ -1708,9 +659,982 @@
         <w:br/>
         <w:t>rasa run actions</w:t>
       </w:r>
+    </w:p>
+    <w:p>
+      <w:pPr>
+        <w:rPr>
+          <w:rFonts w:cs="Times New Roman"/>
+          <w:sz w:val="26"/>
+          <w:szCs w:val="26"/>
+        </w:rPr>
+      </w:pPr>
+    </w:p>
+    <w:p>
+      <w:pPr>
+        <w:pStyle w:val="oancuaDanhsach"/>
+        <w:numPr>
+          <w:ilvl w:val="0"/>
+          <w:numId w:val="13"/>
+        </w:numPr>
+        <w:rPr>
+          <w:rFonts w:cs="Times New Roman"/>
+          <w:sz w:val="26"/>
+          <w:szCs w:val="26"/>
+        </w:rPr>
+      </w:pPr>
       <w:r>
-        <w:br/>
+        <w:rPr>
+          <w:rFonts w:cs="Times New Roman"/>
+          <w:sz w:val="26"/>
+          <w:szCs w:val="26"/>
+        </w:rPr>
+        <w:t>Với chatbot rasa nếu như có hosting có domain thì có thể chỉnh sửa tên miền ở main.py để chạy (Khuyến nghị sử dụng ngrok)</w:t>
       </w:r>
+    </w:p>
+    <w:p>
+      <w:pPr>
+        <w:rPr>
+          <w:rFonts w:cs="Times New Roman"/>
+          <w:sz w:val="26"/>
+          <w:szCs w:val="26"/>
+        </w:rPr>
+      </w:pPr>
+      <w:r>
+        <w:rPr>
+          <w:rFonts w:cs="Times New Roman"/>
+          <w:sz w:val="26"/>
+          <w:szCs w:val="26"/>
+        </w:rPr>
+        <w:br w:type="page"/>
+      </w:r>
+    </w:p>
+    <w:p>
+      <w:pPr>
+        <w:rPr>
+          <w:b/>
+          <w:bCs/>
+        </w:rPr>
+      </w:pPr>
+      <w:r>
+        <w:rPr>
+          <w:b/>
+          <w:bCs/>
+        </w:rPr>
+        <w:lastRenderedPageBreak/>
+        <w:t>HƯỚNG DẪN SỬ DỤNG:</w:t>
+      </w:r>
+    </w:p>
+    <w:p>
+      <w:pPr>
+        <w:pStyle w:val="oancuaDanhsach"/>
+        <w:numPr>
+          <w:ilvl w:val="0"/>
+          <w:numId w:val="10"/>
+        </w:numPr>
+      </w:pPr>
+      <w:r>
+        <w:t xml:space="preserve">Truy cập vào website </w:t>
+      </w:r>
+      <w:hyperlink r:id="rId6" w:history="1">
+        <w:r>
+          <w:rPr>
+            <w:rStyle w:val="Siuktni"/>
+            <w:rFonts w:cs="Times New Roman"/>
+            <w:sz w:val="26"/>
+            <w:szCs w:val="26"/>
+          </w:rPr>
+          <w:t>http://localhost:8080</w:t>
+        </w:r>
+      </w:hyperlink>
+    </w:p>
+    <w:p>
+      <w:pPr>
+        <w:pStyle w:val="oancuaDanhsach"/>
+        <w:numPr>
+          <w:ilvl w:val="0"/>
+          <w:numId w:val="10"/>
+        </w:numPr>
+      </w:pPr>
+      <w:r>
+        <w:rPr>
+          <w:rFonts w:cs="Times New Roman"/>
+          <w:sz w:val="26"/>
+          <w:szCs w:val="26"/>
+        </w:rPr>
+        <w:t>Truy cập mục Tài khoản trên menu chọn đăng kí nếu chưa có tài khoản, đăng nhập nếu đã có tài khoản</w:t>
+      </w:r>
+    </w:p>
+    <w:p>
+      <w:pPr>
+        <w:pStyle w:val="oancuaDanhsach"/>
+        <w:numPr>
+          <w:ilvl w:val="0"/>
+          <w:numId w:val="10"/>
+        </w:numPr>
+      </w:pPr>
+      <w:r>
+        <w:rPr>
+          <w:rFonts w:cs="Times New Roman"/>
+          <w:sz w:val="26"/>
+          <w:szCs w:val="26"/>
+        </w:rPr>
+        <w:t>Nhập đầy đủ thông tin và bấm Đăng nhập / Đăng kí tương ứng, có thể lựa chọn đăng nhập bằng google nếu muốn đăng nhập bằng google</w:t>
+      </w:r>
+    </w:p>
+    <w:p>
+      <w:pPr>
+        <w:pStyle w:val="oancuaDanhsach"/>
+        <w:numPr>
+          <w:ilvl w:val="0"/>
+          <w:numId w:val="10"/>
+        </w:numPr>
+      </w:pPr>
+      <w:r>
+        <w:t>Sử dụng các chức năng trên website</w:t>
+      </w:r>
+    </w:p>
+    <w:p/>
+    <w:p>
+      <w:pPr>
+        <w:pStyle w:val="oancuaDanhsach"/>
+        <w:numPr>
+          <w:ilvl w:val="0"/>
+          <w:numId w:val="12"/>
+        </w:numPr>
+      </w:pPr>
+      <w:r>
+        <w:t>Chức năng tra cứu phương thức xét tuyển</w:t>
+      </w:r>
+      <w:r>
+        <w:t xml:space="preserve"> và tra cứu thông tin ngành:</w:t>
+      </w:r>
+    </w:p>
+    <w:p>
+      <w:pPr>
+        <w:pStyle w:val="oancuaDanhsach"/>
+        <w:numPr>
+          <w:ilvl w:val="1"/>
+          <w:numId w:val="12"/>
+        </w:numPr>
+      </w:pPr>
+      <w:r>
+        <w:t>Truy cập mục Tuyển sinh năm 2025 trên menu chính:</w:t>
+      </w:r>
+    </w:p>
+    <w:p>
+      <w:r>
+        <w:drawing>
+          <wp:inline distT="0" distB="0" distL="0" distR="0" wp14:anchorId="4D387D6A" wp14:editId="1CA24168">
+            <wp:extent cx="5486400" cy="2484755"/>
+            <wp:effectExtent l="0" t="0" r="0" b="0"/>
+            <wp:docPr id="352206961" name="Hình ảnh 1" descr="Ảnh có chứa văn bản, trang phục, người, ảnh chụp màn hình&#10;&#10;Nội dung do AI tạo ra có thể không chính xác."/>
+            <wp:cNvGraphicFramePr>
+              <a:graphicFrameLocks xmlns:a="http://schemas.openxmlformats.org/drawingml/2006/main" noChangeAspect="1"/>
+            </wp:cNvGraphicFramePr>
+            <a:graphic xmlns:a="http://schemas.openxmlformats.org/drawingml/2006/main">
+              <a:graphicData uri="http://schemas.openxmlformats.org/drawingml/2006/picture">
+                <pic:pic xmlns:pic="http://schemas.openxmlformats.org/drawingml/2006/picture">
+                  <pic:nvPicPr>
+                    <pic:cNvPr id="352206961" name="Hình ảnh 1" descr="Ảnh có chứa văn bản, trang phục, người, ảnh chụp màn hình&#10;&#10;Nội dung do AI tạo ra có thể không chính xác."/>
+                    <pic:cNvPicPr/>
+                  </pic:nvPicPr>
+                  <pic:blipFill>
+                    <a:blip r:embed="rId7"/>
+                    <a:stretch>
+                      <a:fillRect/>
+                    </a:stretch>
+                  </pic:blipFill>
+                  <pic:spPr>
+                    <a:xfrm>
+                      <a:off x="0" y="0"/>
+                      <a:ext cx="5486400" cy="2484755"/>
+                    </a:xfrm>
+                    <a:prstGeom prst="rect">
+                      <a:avLst/>
+                    </a:prstGeom>
+                  </pic:spPr>
+                </pic:pic>
+              </a:graphicData>
+            </a:graphic>
+          </wp:inline>
+        </w:drawing>
+      </w:r>
+    </w:p>
+    <w:p>
+      <w:pPr>
+        <w:pStyle w:val="oancuaDanhsach"/>
+        <w:numPr>
+          <w:ilvl w:val="1"/>
+          <w:numId w:val="12"/>
+        </w:numPr>
+      </w:pPr>
+      <w:r>
+        <w:t>Chọn Thông tin tuyển sinh chung hoặc một trong 6 phương thức để xem thông tin</w:t>
+      </w:r>
+    </w:p>
+    <w:p>
+      <w:r>
+        <w:lastRenderedPageBreak/>
+        <w:drawing>
+          <wp:inline distT="0" distB="0" distL="0" distR="0" wp14:anchorId="73971925" wp14:editId="1218138C">
+            <wp:extent cx="5806775" cy="2762250"/>
+            <wp:effectExtent l="0" t="0" r="3810" b="0"/>
+            <wp:docPr id="555419290" name="Hình ảnh 1" descr="Ảnh có chứa văn bản, ảnh chụp màn hình, số, phần mềm&#10;&#10;Nội dung do AI tạo ra có thể không chính xác."/>
+            <wp:cNvGraphicFramePr>
+              <a:graphicFrameLocks xmlns:a="http://schemas.openxmlformats.org/drawingml/2006/main" noChangeAspect="1"/>
+            </wp:cNvGraphicFramePr>
+            <a:graphic xmlns:a="http://schemas.openxmlformats.org/drawingml/2006/main">
+              <a:graphicData uri="http://schemas.openxmlformats.org/drawingml/2006/picture">
+                <pic:pic xmlns:pic="http://schemas.openxmlformats.org/drawingml/2006/picture">
+                  <pic:nvPicPr>
+                    <pic:cNvPr id="555419290" name="Hình ảnh 1" descr="Ảnh có chứa văn bản, ảnh chụp màn hình, số, phần mềm&#10;&#10;Nội dung do AI tạo ra có thể không chính xác."/>
+                    <pic:cNvPicPr/>
+                  </pic:nvPicPr>
+                  <pic:blipFill>
+                    <a:blip r:embed="rId8"/>
+                    <a:stretch>
+                      <a:fillRect/>
+                    </a:stretch>
+                  </pic:blipFill>
+                  <pic:spPr>
+                    <a:xfrm>
+                      <a:off x="0" y="0"/>
+                      <a:ext cx="5817688" cy="2767441"/>
+                    </a:xfrm>
+                    <a:prstGeom prst="rect">
+                      <a:avLst/>
+                    </a:prstGeom>
+                  </pic:spPr>
+                </pic:pic>
+              </a:graphicData>
+            </a:graphic>
+          </wp:inline>
+        </w:drawing>
+      </w:r>
+    </w:p>
+    <w:p>
+      <w:r>
+        <w:drawing>
+          <wp:inline distT="0" distB="0" distL="0" distR="0" wp14:anchorId="7CD1C8E8" wp14:editId="7B906C12">
+            <wp:extent cx="5486400" cy="2621280"/>
+            <wp:effectExtent l="0" t="0" r="0" b="7620"/>
+            <wp:docPr id="761226671" name="Hình ảnh 1" descr="Ảnh có chứa văn bản, ảnh chụp màn hình, phần mềm, số&#10;&#10;Nội dung do AI tạo ra có thể không chính xác."/>
+            <wp:cNvGraphicFramePr>
+              <a:graphicFrameLocks xmlns:a="http://schemas.openxmlformats.org/drawingml/2006/main" noChangeAspect="1"/>
+            </wp:cNvGraphicFramePr>
+            <a:graphic xmlns:a="http://schemas.openxmlformats.org/drawingml/2006/main">
+              <a:graphicData uri="http://schemas.openxmlformats.org/drawingml/2006/picture">
+                <pic:pic xmlns:pic="http://schemas.openxmlformats.org/drawingml/2006/picture">
+                  <pic:nvPicPr>
+                    <pic:cNvPr id="761226671" name="Hình ảnh 1" descr="Ảnh có chứa văn bản, ảnh chụp màn hình, phần mềm, số&#10;&#10;Nội dung do AI tạo ra có thể không chính xác."/>
+                    <pic:cNvPicPr/>
+                  </pic:nvPicPr>
+                  <pic:blipFill>
+                    <a:blip r:embed="rId9"/>
+                    <a:stretch>
+                      <a:fillRect/>
+                    </a:stretch>
+                  </pic:blipFill>
+                  <pic:spPr>
+                    <a:xfrm>
+                      <a:off x="0" y="0"/>
+                      <a:ext cx="5486400" cy="2621280"/>
+                    </a:xfrm>
+                    <a:prstGeom prst="rect">
+                      <a:avLst/>
+                    </a:prstGeom>
+                  </pic:spPr>
+                </pic:pic>
+              </a:graphicData>
+            </a:graphic>
+          </wp:inline>
+        </w:drawing>
+      </w:r>
+    </w:p>
+    <w:p>
+      <w:pPr>
+        <w:pStyle w:val="oancuaDanhsach"/>
+        <w:numPr>
+          <w:ilvl w:val="1"/>
+          <w:numId w:val="12"/>
+        </w:numPr>
+      </w:pPr>
+      <w:r>
+        <w:t>Người dùng có thể truy cập vào Danh sách ngành tuyển sinh để xem thông tin tuyển sinh từ một ngành thông qua nút xem và chi tiết</w:t>
+      </w:r>
+    </w:p>
+    <w:p>
+      <w:r>
+        <w:lastRenderedPageBreak/>
+        <w:drawing>
+          <wp:inline distT="0" distB="0" distL="0" distR="0" wp14:anchorId="2707FC92" wp14:editId="0EC7BEB0">
+            <wp:extent cx="5486400" cy="2630805"/>
+            <wp:effectExtent l="0" t="0" r="0" b="0"/>
+            <wp:docPr id="910989417" name="Hình ảnh 1" descr="Ảnh có chứa văn bản, ảnh chụp màn hình, số, phần mềm&#10;&#10;Nội dung do AI tạo ra có thể không chính xác."/>
+            <wp:cNvGraphicFramePr>
+              <a:graphicFrameLocks xmlns:a="http://schemas.openxmlformats.org/drawingml/2006/main" noChangeAspect="1"/>
+            </wp:cNvGraphicFramePr>
+            <a:graphic xmlns:a="http://schemas.openxmlformats.org/drawingml/2006/main">
+              <a:graphicData uri="http://schemas.openxmlformats.org/drawingml/2006/picture">
+                <pic:pic xmlns:pic="http://schemas.openxmlformats.org/drawingml/2006/picture">
+                  <pic:nvPicPr>
+                    <pic:cNvPr id="910989417" name="Hình ảnh 1" descr="Ảnh có chứa văn bản, ảnh chụp màn hình, số, phần mềm&#10;&#10;Nội dung do AI tạo ra có thể không chính xác."/>
+                    <pic:cNvPicPr/>
+                  </pic:nvPicPr>
+                  <pic:blipFill>
+                    <a:blip r:embed="rId10"/>
+                    <a:stretch>
+                      <a:fillRect/>
+                    </a:stretch>
+                  </pic:blipFill>
+                  <pic:spPr>
+                    <a:xfrm>
+                      <a:off x="0" y="0"/>
+                      <a:ext cx="5486400" cy="2630805"/>
+                    </a:xfrm>
+                    <a:prstGeom prst="rect">
+                      <a:avLst/>
+                    </a:prstGeom>
+                  </pic:spPr>
+                </pic:pic>
+              </a:graphicData>
+            </a:graphic>
+          </wp:inline>
+        </w:drawing>
+      </w:r>
+    </w:p>
+    <w:p>
+      <w:pPr>
+        <w:jc w:val="center"/>
+        <w:rPr>
+          <w:noProof/>
+        </w:rPr>
+      </w:pPr>
+      <w:r>
+        <w:drawing>
+          <wp:inline distT="0" distB="0" distL="0" distR="0" wp14:anchorId="21F5039A" wp14:editId="32001A1F">
+            <wp:extent cx="5486400" cy="2513965"/>
+            <wp:effectExtent l="0" t="0" r="0" b="635"/>
+            <wp:docPr id="1389357636" name="Hình ảnh 1" descr="Ảnh có chứa văn bản, số, phần mềm, Biểu tượng máy tính&#10;&#10;Nội dung do AI tạo ra có thể không chính xác."/>
+            <wp:cNvGraphicFramePr>
+              <a:graphicFrameLocks xmlns:a="http://schemas.openxmlformats.org/drawingml/2006/main" noChangeAspect="1"/>
+            </wp:cNvGraphicFramePr>
+            <a:graphic xmlns:a="http://schemas.openxmlformats.org/drawingml/2006/main">
+              <a:graphicData uri="http://schemas.openxmlformats.org/drawingml/2006/picture">
+                <pic:pic xmlns:pic="http://schemas.openxmlformats.org/drawingml/2006/picture">
+                  <pic:nvPicPr>
+                    <pic:cNvPr id="1389357636" name="Hình ảnh 1" descr="Ảnh có chứa văn bản, số, phần mềm, Biểu tượng máy tính&#10;&#10;Nội dung do AI tạo ra có thể không chính xác."/>
+                    <pic:cNvPicPr/>
+                  </pic:nvPicPr>
+                  <pic:blipFill>
+                    <a:blip r:embed="rId11"/>
+                    <a:stretch>
+                      <a:fillRect/>
+                    </a:stretch>
+                  </pic:blipFill>
+                  <pic:spPr>
+                    <a:xfrm>
+                      <a:off x="0" y="0"/>
+                      <a:ext cx="5486400" cy="2513965"/>
+                    </a:xfrm>
+                    <a:prstGeom prst="rect">
+                      <a:avLst/>
+                    </a:prstGeom>
+                  </pic:spPr>
+                </pic:pic>
+              </a:graphicData>
+            </a:graphic>
+          </wp:inline>
+        </w:drawing>
+      </w:r>
+      <w:r>
+        <w:drawing>
+          <wp:inline distT="0" distB="0" distL="0" distR="0" wp14:anchorId="41BB0685" wp14:editId="21DDFCEC">
+            <wp:extent cx="5486400" cy="2174240"/>
+            <wp:effectExtent l="0" t="0" r="0" b="0"/>
+            <wp:docPr id="913811062" name="Hình ảnh 1" descr="Ảnh có chứa văn bản, Phông chữ, Trang web, phần mềm&#10;&#10;Nội dung do AI tạo ra có thể không chính xác."/>
+            <wp:cNvGraphicFramePr>
+              <a:graphicFrameLocks xmlns:a="http://schemas.openxmlformats.org/drawingml/2006/main" noChangeAspect="1"/>
+            </wp:cNvGraphicFramePr>
+            <a:graphic xmlns:a="http://schemas.openxmlformats.org/drawingml/2006/main">
+              <a:graphicData uri="http://schemas.openxmlformats.org/drawingml/2006/picture">
+                <pic:pic xmlns:pic="http://schemas.openxmlformats.org/drawingml/2006/picture">
+                  <pic:nvPicPr>
+                    <pic:cNvPr id="913811062" name="Hình ảnh 1" descr="Ảnh có chứa văn bản, Phông chữ, Trang web, phần mềm&#10;&#10;Nội dung do AI tạo ra có thể không chính xác."/>
+                    <pic:cNvPicPr/>
+                  </pic:nvPicPr>
+                  <pic:blipFill>
+                    <a:blip r:embed="rId12"/>
+                    <a:stretch>
+                      <a:fillRect/>
+                    </a:stretch>
+                  </pic:blipFill>
+                  <pic:spPr>
+                    <a:xfrm>
+                      <a:off x="0" y="0"/>
+                      <a:ext cx="5486400" cy="2174240"/>
+                    </a:xfrm>
+                    <a:prstGeom prst="rect">
+                      <a:avLst/>
+                    </a:prstGeom>
+                  </pic:spPr>
+                </pic:pic>
+              </a:graphicData>
+            </a:graphic>
+          </wp:inline>
+        </w:drawing>
+      </w:r>
+    </w:p>
+    <w:p>
+      <w:pPr>
+        <w:pStyle w:val="oancuaDanhsach"/>
+        <w:numPr>
+          <w:ilvl w:val="0"/>
+          <w:numId w:val="12"/>
+        </w:numPr>
+      </w:pPr>
+      <w:r>
+        <w:t>Tra cứu chương trình đào tạo</w:t>
+      </w:r>
+    </w:p>
+    <w:p>
+      <w:pPr>
+        <w:pStyle w:val="oancuaDanhsach"/>
+        <w:numPr>
+          <w:ilvl w:val="1"/>
+          <w:numId w:val="12"/>
+        </w:numPr>
+      </w:pPr>
+      <w:r>
+        <w:t>Truy cập mục CTĐT trên thanh menu, xem và chọn Khoa quản lý ngành đào tạo từ danh sách</w:t>
+      </w:r>
+    </w:p>
+    <w:p>
+      <w:pPr>
+        <w:ind w:left="1080"/>
+      </w:pPr>
+      <w:r>
+        <w:lastRenderedPageBreak/>
+        <w:drawing>
+          <wp:inline distT="0" distB="0" distL="0" distR="0" wp14:anchorId="482FEC0D" wp14:editId="57D21DD3">
+            <wp:extent cx="5486400" cy="2694305"/>
+            <wp:effectExtent l="0" t="0" r="0" b="0"/>
+            <wp:docPr id="254506968" name="Hình ảnh 1" descr="Ảnh có chứa văn bản, phần mềm, Trang web, Biểu tượng máy tính&#10;&#10;Nội dung do AI tạo ra có thể không chính xác."/>
+            <wp:cNvGraphicFramePr>
+              <a:graphicFrameLocks xmlns:a="http://schemas.openxmlformats.org/drawingml/2006/main" noChangeAspect="1"/>
+            </wp:cNvGraphicFramePr>
+            <a:graphic xmlns:a="http://schemas.openxmlformats.org/drawingml/2006/main">
+              <a:graphicData uri="http://schemas.openxmlformats.org/drawingml/2006/picture">
+                <pic:pic xmlns:pic="http://schemas.openxmlformats.org/drawingml/2006/picture">
+                  <pic:nvPicPr>
+                    <pic:cNvPr id="254506968" name="Hình ảnh 1" descr="Ảnh có chứa văn bản, phần mềm, Trang web, Biểu tượng máy tính&#10;&#10;Nội dung do AI tạo ra có thể không chính xác."/>
+                    <pic:cNvPicPr/>
+                  </pic:nvPicPr>
+                  <pic:blipFill>
+                    <a:blip r:embed="rId13"/>
+                    <a:stretch>
+                      <a:fillRect/>
+                    </a:stretch>
+                  </pic:blipFill>
+                  <pic:spPr>
+                    <a:xfrm>
+                      <a:off x="0" y="0"/>
+                      <a:ext cx="5486400" cy="2694305"/>
+                    </a:xfrm>
+                    <a:prstGeom prst="rect">
+                      <a:avLst/>
+                    </a:prstGeom>
+                  </pic:spPr>
+                </pic:pic>
+              </a:graphicData>
+            </a:graphic>
+          </wp:inline>
+        </w:drawing>
+      </w:r>
+    </w:p>
+    <w:p>
+      <w:pPr>
+        <w:pStyle w:val="oancuaDanhsach"/>
+        <w:numPr>
+          <w:ilvl w:val="1"/>
+          <w:numId w:val="12"/>
+        </w:numPr>
+      </w:pPr>
+      <w:r>
+        <w:t>Chọn ngành học và chương trình đào tạo tương ứng để xem chương trình đào tạo</w:t>
+      </w:r>
+    </w:p>
+    <w:p>
+      <w:pPr>
+        <w:ind w:left="1080"/>
+      </w:pPr>
+      <w:r>
+        <w:drawing>
+          <wp:inline distT="0" distB="0" distL="0" distR="0" wp14:anchorId="53140701" wp14:editId="0AC5E45A">
+            <wp:extent cx="5486400" cy="2722880"/>
+            <wp:effectExtent l="0" t="0" r="0" b="1270"/>
+            <wp:docPr id="1825165319" name="Hình ảnh 1" descr="Ảnh có chứa văn bản, ảnh chụp màn hình, số, phần mềm&#10;&#10;Nội dung do AI tạo ra có thể không chính xác."/>
+            <wp:cNvGraphicFramePr>
+              <a:graphicFrameLocks xmlns:a="http://schemas.openxmlformats.org/drawingml/2006/main" noChangeAspect="1"/>
+            </wp:cNvGraphicFramePr>
+            <a:graphic xmlns:a="http://schemas.openxmlformats.org/drawingml/2006/main">
+              <a:graphicData uri="http://schemas.openxmlformats.org/drawingml/2006/picture">
+                <pic:pic xmlns:pic="http://schemas.openxmlformats.org/drawingml/2006/picture">
+                  <pic:nvPicPr>
+                    <pic:cNvPr id="1825165319" name="Hình ảnh 1" descr="Ảnh có chứa văn bản, ảnh chụp màn hình, số, phần mềm&#10;&#10;Nội dung do AI tạo ra có thể không chính xác."/>
+                    <pic:cNvPicPr/>
+                  </pic:nvPicPr>
+                  <pic:blipFill>
+                    <a:blip r:embed="rId14"/>
+                    <a:stretch>
+                      <a:fillRect/>
+                    </a:stretch>
+                  </pic:blipFill>
+                  <pic:spPr>
+                    <a:xfrm>
+                      <a:off x="0" y="0"/>
+                      <a:ext cx="5486400" cy="2722880"/>
+                    </a:xfrm>
+                    <a:prstGeom prst="rect">
+                      <a:avLst/>
+                    </a:prstGeom>
+                  </pic:spPr>
+                </pic:pic>
+              </a:graphicData>
+            </a:graphic>
+          </wp:inline>
+        </w:drawing>
+      </w:r>
+    </w:p>
+    <w:p>
+      <w:pPr>
+        <w:pStyle w:val="oancuaDanhsach"/>
+        <w:numPr>
+          <w:ilvl w:val="0"/>
+          <w:numId w:val="12"/>
+        </w:numPr>
+      </w:pPr>
+      <w:r>
+        <w:t>Trò chuyện với chatbot</w:t>
+      </w:r>
+    </w:p>
+    <w:p>
+      <w:pPr>
+        <w:pStyle w:val="oancuaDanhsach"/>
+        <w:numPr>
+          <w:ilvl w:val="1"/>
+          <w:numId w:val="12"/>
+        </w:numPr>
+      </w:pPr>
+      <w:r>
+        <w:t>Truy cập bằng cách chọn icon tin nhắn hoặc Tư vấn -&gt; Chat với trợ lý ở trên thanh menu</w:t>
+      </w:r>
+    </w:p>
+    <w:p>
+      <w:pPr>
+        <w:pStyle w:val="oancuaDanhsach"/>
+        <w:numPr>
+          <w:ilvl w:val="1"/>
+          <w:numId w:val="12"/>
+        </w:numPr>
+      </w:pPr>
+      <w:r>
+        <w:t>Hỏi đáp thông tin cần tư vấn tuyển sinh</w:t>
+      </w:r>
+    </w:p>
+    <w:p>
+      <w:pPr>
+        <w:jc w:val="center"/>
+      </w:pPr>
+      <w:r>
+        <w:lastRenderedPageBreak/>
+        <w:drawing>
+          <wp:inline distT="0" distB="0" distL="0" distR="0" wp14:anchorId="3A416C23" wp14:editId="7CD6CA66">
+            <wp:extent cx="3062019" cy="3762375"/>
+            <wp:effectExtent l="0" t="0" r="5080" b="0"/>
+            <wp:docPr id="207824658" name="Hình ảnh 1" descr="Ảnh có chứa văn bản, đồ điện tử, ảnh chụp màn hình, Phông chữ&#10;&#10;Nội dung do AI tạo ra có thể không chính xác."/>
+            <wp:cNvGraphicFramePr>
+              <a:graphicFrameLocks xmlns:a="http://schemas.openxmlformats.org/drawingml/2006/main" noChangeAspect="1"/>
+            </wp:cNvGraphicFramePr>
+            <a:graphic xmlns:a="http://schemas.openxmlformats.org/drawingml/2006/main">
+              <a:graphicData uri="http://schemas.openxmlformats.org/drawingml/2006/picture">
+                <pic:pic xmlns:pic="http://schemas.openxmlformats.org/drawingml/2006/picture">
+                  <pic:nvPicPr>
+                    <pic:cNvPr id="207824658" name="Hình ảnh 1" descr="Ảnh có chứa văn bản, đồ điện tử, ảnh chụp màn hình, Phông chữ&#10;&#10;Nội dung do AI tạo ra có thể không chính xác."/>
+                    <pic:cNvPicPr/>
+                  </pic:nvPicPr>
+                  <pic:blipFill>
+                    <a:blip r:embed="rId15"/>
+                    <a:stretch>
+                      <a:fillRect/>
+                    </a:stretch>
+                  </pic:blipFill>
+                  <pic:spPr>
+                    <a:xfrm>
+                      <a:off x="0" y="0"/>
+                      <a:ext cx="3065484" cy="3766633"/>
+                    </a:xfrm>
+                    <a:prstGeom prst="rect">
+                      <a:avLst/>
+                    </a:prstGeom>
+                  </pic:spPr>
+                </pic:pic>
+              </a:graphicData>
+            </a:graphic>
+          </wp:inline>
+        </w:drawing>
+      </w:r>
+    </w:p>
+    <w:p>
+      <w:pPr>
+        <w:jc w:val="center"/>
+      </w:pPr>
+      <w:r>
+        <w:drawing>
+          <wp:inline distT="0" distB="0" distL="0" distR="0" wp14:anchorId="3598CBDF" wp14:editId="28AF187B">
+            <wp:extent cx="5486400" cy="3867150"/>
+            <wp:effectExtent l="0" t="0" r="0" b="0"/>
+            <wp:docPr id="1544574978" name="Hình ảnh 1" descr="Ảnh có chứa văn bản, ảnh chụp màn hình, phần mềm, Trang web&#10;&#10;Nội dung do AI tạo ra có thể không chính xác."/>
+            <wp:cNvGraphicFramePr>
+              <a:graphicFrameLocks xmlns:a="http://schemas.openxmlformats.org/drawingml/2006/main" noChangeAspect="1"/>
+            </wp:cNvGraphicFramePr>
+            <a:graphic xmlns:a="http://schemas.openxmlformats.org/drawingml/2006/main">
+              <a:graphicData uri="http://schemas.openxmlformats.org/drawingml/2006/picture">
+                <pic:pic xmlns:pic="http://schemas.openxmlformats.org/drawingml/2006/picture">
+                  <pic:nvPicPr>
+                    <pic:cNvPr id="1544574978" name="Hình ảnh 1" descr="Ảnh có chứa văn bản, ảnh chụp màn hình, phần mềm, Trang web&#10;&#10;Nội dung do AI tạo ra có thể không chính xác."/>
+                    <pic:cNvPicPr/>
+                  </pic:nvPicPr>
+                  <pic:blipFill>
+                    <a:blip r:embed="rId16"/>
+                    <a:stretch>
+                      <a:fillRect/>
+                    </a:stretch>
+                  </pic:blipFill>
+                  <pic:spPr>
+                    <a:xfrm>
+                      <a:off x="0" y="0"/>
+                      <a:ext cx="5486400" cy="3867150"/>
+                    </a:xfrm>
+                    <a:prstGeom prst="rect">
+                      <a:avLst/>
+                    </a:prstGeom>
+                  </pic:spPr>
+                </pic:pic>
+              </a:graphicData>
+            </a:graphic>
+          </wp:inline>
+        </w:drawing>
+      </w:r>
+    </w:p>
+    <w:p>
+      <w:pPr>
+        <w:pStyle w:val="oancuaDanhsach"/>
+        <w:numPr>
+          <w:ilvl w:val="0"/>
+          <w:numId w:val="12"/>
+        </w:numPr>
+      </w:pPr>
+      <w:r>
+        <w:t>Tính điểm xét tuyển</w:t>
+      </w:r>
+    </w:p>
+    <w:p>
+      <w:pPr>
+        <w:pStyle w:val="oancuaDanhsach"/>
+        <w:numPr>
+          <w:ilvl w:val="1"/>
+          <w:numId w:val="12"/>
+        </w:numPr>
+      </w:pPr>
+      <w:r>
+        <w:lastRenderedPageBreak/>
+        <w:t>Truy cập mục công cụ ở thanh menu</w:t>
+      </w:r>
+    </w:p>
+    <w:p>
+      <w:pPr>
+        <w:ind w:left="1080"/>
+      </w:pPr>
+      <w:r>
+        <w:drawing>
+          <wp:inline distT="0" distB="0" distL="0" distR="0" wp14:anchorId="505007BC" wp14:editId="38B188A5">
+            <wp:extent cx="5486400" cy="789305"/>
+            <wp:effectExtent l="0" t="0" r="0" b="0"/>
+            <wp:docPr id="68372938" name="Hình ảnh 1" descr="Ảnh có chứa văn bản, ảnh chụp màn hình, phần mềm, Trang web&#10;&#10;Nội dung do AI tạo ra có thể không chính xác."/>
+            <wp:cNvGraphicFramePr>
+              <a:graphicFrameLocks xmlns:a="http://schemas.openxmlformats.org/drawingml/2006/main" noChangeAspect="1"/>
+            </wp:cNvGraphicFramePr>
+            <a:graphic xmlns:a="http://schemas.openxmlformats.org/drawingml/2006/main">
+              <a:graphicData uri="http://schemas.openxmlformats.org/drawingml/2006/picture">
+                <pic:pic xmlns:pic="http://schemas.openxmlformats.org/drawingml/2006/picture">
+                  <pic:nvPicPr>
+                    <pic:cNvPr id="68372938" name="Hình ảnh 1" descr="Ảnh có chứa văn bản, ảnh chụp màn hình, phần mềm, Trang web&#10;&#10;Nội dung do AI tạo ra có thể không chính xác."/>
+                    <pic:cNvPicPr/>
+                  </pic:nvPicPr>
+                  <pic:blipFill>
+                    <a:blip r:embed="rId17"/>
+                    <a:stretch>
+                      <a:fillRect/>
+                    </a:stretch>
+                  </pic:blipFill>
+                  <pic:spPr>
+                    <a:xfrm>
+                      <a:off x="0" y="0"/>
+                      <a:ext cx="5486400" cy="789305"/>
+                    </a:xfrm>
+                    <a:prstGeom prst="rect">
+                      <a:avLst/>
+                    </a:prstGeom>
+                  </pic:spPr>
+                </pic:pic>
+              </a:graphicData>
+            </a:graphic>
+          </wp:inline>
+        </w:drawing>
+      </w:r>
+    </w:p>
+    <w:p>
+      <w:pPr>
+        <w:pStyle w:val="oancuaDanhsach"/>
+        <w:numPr>
+          <w:ilvl w:val="1"/>
+          <w:numId w:val="12"/>
+        </w:numPr>
+      </w:pPr>
+      <w:r>
+        <w:t>Chọn một trong 3 mục là tính điểm xét tuyển học bạ THPT, tính điểm xét tuyển thi THPT, Tính điểm PT Xét tuyển riêng</w:t>
+      </w:r>
+    </w:p>
+    <w:p>
+      <w:pPr>
+        <w:pStyle w:val="oancuaDanhsach"/>
+        <w:numPr>
+          <w:ilvl w:val="1"/>
+          <w:numId w:val="12"/>
+        </w:numPr>
+      </w:pPr>
+      <w:r>
+        <w:t>Nhập thông tin môn học, điểm, thành tích tương ứng với từng phương thức</w:t>
+      </w:r>
+    </w:p>
+    <w:p>
+      <w:pPr>
+        <w:pStyle w:val="oancuaDanhsach"/>
+        <w:ind w:left="1440"/>
+      </w:pPr>
+      <w:r>
+        <w:drawing>
+          <wp:inline distT="0" distB="0" distL="0" distR="0" wp14:anchorId="2B3B43B0" wp14:editId="1C182982">
+            <wp:extent cx="5486400" cy="2038985"/>
+            <wp:effectExtent l="0" t="0" r="0" b="0"/>
+            <wp:docPr id="732698109" name="Hình ảnh 1" descr="Ảnh có chứa văn bản, ảnh chụp màn hình, số, Phông chữ&#10;&#10;Nội dung do AI tạo ra có thể không chính xác."/>
+            <wp:cNvGraphicFramePr>
+              <a:graphicFrameLocks xmlns:a="http://schemas.openxmlformats.org/drawingml/2006/main" noChangeAspect="1"/>
+            </wp:cNvGraphicFramePr>
+            <a:graphic xmlns:a="http://schemas.openxmlformats.org/drawingml/2006/main">
+              <a:graphicData uri="http://schemas.openxmlformats.org/drawingml/2006/picture">
+                <pic:pic xmlns:pic="http://schemas.openxmlformats.org/drawingml/2006/picture">
+                  <pic:nvPicPr>
+                    <pic:cNvPr id="732698109" name="Hình ảnh 1" descr="Ảnh có chứa văn bản, ảnh chụp màn hình, số, Phông chữ&#10;&#10;Nội dung do AI tạo ra có thể không chính xác."/>
+                    <pic:cNvPicPr/>
+                  </pic:nvPicPr>
+                  <pic:blipFill>
+                    <a:blip r:embed="rId18"/>
+                    <a:stretch>
+                      <a:fillRect/>
+                    </a:stretch>
+                  </pic:blipFill>
+                  <pic:spPr>
+                    <a:xfrm>
+                      <a:off x="0" y="0"/>
+                      <a:ext cx="5486400" cy="2038985"/>
+                    </a:xfrm>
+                    <a:prstGeom prst="rect">
+                      <a:avLst/>
+                    </a:prstGeom>
+                  </pic:spPr>
+                </pic:pic>
+              </a:graphicData>
+            </a:graphic>
+          </wp:inline>
+        </w:drawing>
+      </w:r>
+    </w:p>
+    <w:p>
+      <w:pPr>
+        <w:pStyle w:val="oancuaDanhsach"/>
+        <w:numPr>
+          <w:ilvl w:val="1"/>
+          <w:numId w:val="12"/>
+        </w:numPr>
+      </w:pPr>
+      <w:r>
+        <w:t>Chọn tính điểm sẽ hiển thị các khối thi được đề xuất (Minh họa ở phương thức xét học bạ)</w:t>
+      </w:r>
+    </w:p>
+    <w:p>
+      <w:pPr>
+        <w:pStyle w:val="oancuaDanhsach"/>
+        <w:ind w:left="1440"/>
+      </w:pPr>
+      <w:r>
+        <w:drawing>
+          <wp:inline distT="0" distB="0" distL="0" distR="0" wp14:anchorId="05354686" wp14:editId="45F896F1">
+            <wp:extent cx="5486400" cy="3352800"/>
+            <wp:effectExtent l="0" t="0" r="0" b="0"/>
+            <wp:docPr id="44727791" name="Hình ảnh 1" descr="Ảnh có chứa văn bản, ảnh chụp màn hình, số, Phông chữ&#10;&#10;Nội dung do AI tạo ra có thể không chính xác."/>
+            <wp:cNvGraphicFramePr>
+              <a:graphicFrameLocks xmlns:a="http://schemas.openxmlformats.org/drawingml/2006/main" noChangeAspect="1"/>
+            </wp:cNvGraphicFramePr>
+            <a:graphic xmlns:a="http://schemas.openxmlformats.org/drawingml/2006/main">
+              <a:graphicData uri="http://schemas.openxmlformats.org/drawingml/2006/picture">
+                <pic:pic xmlns:pic="http://schemas.openxmlformats.org/drawingml/2006/picture">
+                  <pic:nvPicPr>
+                    <pic:cNvPr id="44727791" name="Hình ảnh 1" descr="Ảnh có chứa văn bản, ảnh chụp màn hình, số, Phông chữ&#10;&#10;Nội dung do AI tạo ra có thể không chính xác."/>
+                    <pic:cNvPicPr/>
+                  </pic:nvPicPr>
+                  <pic:blipFill>
+                    <a:blip r:embed="rId19"/>
+                    <a:stretch>
+                      <a:fillRect/>
+                    </a:stretch>
+                  </pic:blipFill>
+                  <pic:spPr>
+                    <a:xfrm>
+                      <a:off x="0" y="0"/>
+                      <a:ext cx="5486400" cy="3352800"/>
+                    </a:xfrm>
+                    <a:prstGeom prst="rect">
+                      <a:avLst/>
+                    </a:prstGeom>
+                  </pic:spPr>
+                </pic:pic>
+              </a:graphicData>
+            </a:graphic>
+          </wp:inline>
+        </w:drawing>
+      </w:r>
+    </w:p>
+    <w:p>
+      <w:pPr>
+        <w:pStyle w:val="oancuaDanhsach"/>
+        <w:numPr>
+          <w:ilvl w:val="1"/>
+          <w:numId w:val="12"/>
+        </w:numPr>
+      </w:pPr>
+      <w:r>
+        <w:lastRenderedPageBreak/>
+        <w:t>Chọn nút Tính điểm ưu tiên -&gt; Nhập các thông tin ưu tiên khu vực, ưu tiên đối tượng -&gt; Tính điểm</w:t>
+      </w:r>
+    </w:p>
+    <w:p>
+      <w:pPr>
+        <w:pStyle w:val="oancuaDanhsach"/>
+        <w:ind w:left="1440"/>
+      </w:pPr>
+      <w:r>
+        <w:drawing>
+          <wp:inline distT="0" distB="0" distL="0" distR="0" wp14:anchorId="46B0F347" wp14:editId="5D0878C2">
+            <wp:extent cx="5486400" cy="3282315"/>
+            <wp:effectExtent l="0" t="0" r="0" b="0"/>
+            <wp:docPr id="385190184" name="Hình ảnh 1" descr="Ảnh có chứa văn bản, ảnh chụp màn hình, số, Phông chữ&#10;&#10;Nội dung do AI tạo ra có thể không chính xác."/>
+            <wp:cNvGraphicFramePr>
+              <a:graphicFrameLocks xmlns:a="http://schemas.openxmlformats.org/drawingml/2006/main" noChangeAspect="1"/>
+            </wp:cNvGraphicFramePr>
+            <a:graphic xmlns:a="http://schemas.openxmlformats.org/drawingml/2006/main">
+              <a:graphicData uri="http://schemas.openxmlformats.org/drawingml/2006/picture">
+                <pic:pic xmlns:pic="http://schemas.openxmlformats.org/drawingml/2006/picture">
+                  <pic:nvPicPr>
+                    <pic:cNvPr id="385190184" name="Hình ảnh 1" descr="Ảnh có chứa văn bản, ảnh chụp màn hình, số, Phông chữ&#10;&#10;Nội dung do AI tạo ra có thể không chính xác."/>
+                    <pic:cNvPicPr/>
+                  </pic:nvPicPr>
+                  <pic:blipFill>
+                    <a:blip r:embed="rId20"/>
+                    <a:stretch>
+                      <a:fillRect/>
+                    </a:stretch>
+                  </pic:blipFill>
+                  <pic:spPr>
+                    <a:xfrm>
+                      <a:off x="0" y="0"/>
+                      <a:ext cx="5486400" cy="3282315"/>
+                    </a:xfrm>
+                    <a:prstGeom prst="rect">
+                      <a:avLst/>
+                    </a:prstGeom>
+                  </pic:spPr>
+                </pic:pic>
+              </a:graphicData>
+            </a:graphic>
+          </wp:inline>
+        </w:drawing>
+      </w:r>
+    </w:p>
+    <w:p>
+      <w:pPr>
+        <w:pStyle w:val="oancuaDanhsach"/>
+        <w:numPr>
+          <w:ilvl w:val="1"/>
+          <w:numId w:val="12"/>
+        </w:numPr>
+      </w:pPr>
+      <w:r>
+        <w:t>Chọn nút gợi ý ngành học phù hợp với tổ hợp thi bạn muốn xem. Xem được danh sách ngành đề xuất</w:t>
+      </w:r>
+      <w:r>
+        <w:t xml:space="preserve"> dựa trên tổ hợp và phương thức</w:t>
+      </w:r>
+    </w:p>
+    <w:p>
+      <w:pPr>
+        <w:pStyle w:val="oancuaDanhsach"/>
+        <w:ind w:left="1440"/>
+      </w:pPr>
+      <w:r>
+        <w:drawing>
+          <wp:inline distT="0" distB="0" distL="0" distR="0" wp14:anchorId="27DF8FFE" wp14:editId="3C96EC75">
+            <wp:extent cx="5486400" cy="2945765"/>
+            <wp:effectExtent l="0" t="0" r="0" b="6985"/>
+            <wp:docPr id="1417341479" name="Hình ảnh 1" descr="Ảnh có chứa văn bản, ảnh chụp màn hình, phần mềm, Trang web&#10;&#10;Nội dung do AI tạo ra có thể không chính xác."/>
+            <wp:cNvGraphicFramePr>
+              <a:graphicFrameLocks xmlns:a="http://schemas.openxmlformats.org/drawingml/2006/main" noChangeAspect="1"/>
+            </wp:cNvGraphicFramePr>
+            <a:graphic xmlns:a="http://schemas.openxmlformats.org/drawingml/2006/main">
+              <a:graphicData uri="http://schemas.openxmlformats.org/drawingml/2006/picture">
+                <pic:pic xmlns:pic="http://schemas.openxmlformats.org/drawingml/2006/picture">
+                  <pic:nvPicPr>
+                    <pic:cNvPr id="1417341479" name="Hình ảnh 1" descr="Ảnh có chứa văn bản, ảnh chụp màn hình, phần mềm, Trang web&#10;&#10;Nội dung do AI tạo ra có thể không chính xác."/>
+                    <pic:cNvPicPr/>
+                  </pic:nvPicPr>
+                  <pic:blipFill>
+                    <a:blip r:embed="rId21"/>
+                    <a:stretch>
+                      <a:fillRect/>
+                    </a:stretch>
+                  </pic:blipFill>
+                  <pic:spPr>
+                    <a:xfrm>
+                      <a:off x="0" y="0"/>
+                      <a:ext cx="5486400" cy="2945765"/>
+                    </a:xfrm>
+                    <a:prstGeom prst="rect">
+                      <a:avLst/>
+                    </a:prstGeom>
+                  </pic:spPr>
+                </pic:pic>
+              </a:graphicData>
+            </a:graphic>
+          </wp:inline>
+        </w:drawing>
+      </w:r>
+    </w:p>
+    <w:p>
+      <w:pPr>
+        <w:pStyle w:val="oancuaDanhsach"/>
+        <w:ind w:left="1440"/>
+      </w:pPr>
     </w:p>
     <w:sectPr>
       <w:pgSz w:w="12240" w:h="15840"/>
@@ -1893,6 +1817,386 @@
       <w:rPr>
         <w:rFonts w:ascii="Symbol" w:hAnsi="Symbol" w:hint="default"/>
       </w:rPr>
+    </w:lvl>
+  </w:abstractNum>
+  <w:abstractNum w:abstractNumId="9" w15:restartNumberingAfterBreak="0">
+    <w:nsid w:val="149E1548"/>
+    <w:multiLevelType w:val="hybridMultilevel"/>
+    <w:tmpl w:val="8EF6DA20"/>
+    <w:lvl w:ilvl="0" w:tplc="3F02A208">
+      <w:start w:val="4"/>
+      <w:numFmt w:val="bullet"/>
+      <w:lvlText w:val=""/>
+      <w:lvlJc w:val="left"/>
+      <w:pPr>
+        <w:ind w:left="720" w:hanging="360"/>
+      </w:pPr>
+      <w:rPr>
+        <w:rFonts w:ascii="Symbol" w:eastAsiaTheme="minorEastAsia" w:hAnsi="Symbol" w:cs="Times New Roman" w:hint="default"/>
+      </w:rPr>
+    </w:lvl>
+    <w:lvl w:ilvl="1" w:tplc="04090003" w:tentative="1">
+      <w:start w:val="1"/>
+      <w:numFmt w:val="bullet"/>
+      <w:lvlText w:val="o"/>
+      <w:lvlJc w:val="left"/>
+      <w:pPr>
+        <w:ind w:left="1440" w:hanging="360"/>
+      </w:pPr>
+      <w:rPr>
+        <w:rFonts w:ascii="Courier New" w:hAnsi="Courier New" w:cs="Courier New" w:hint="default"/>
+      </w:rPr>
+    </w:lvl>
+    <w:lvl w:ilvl="2" w:tplc="04090005" w:tentative="1">
+      <w:start w:val="1"/>
+      <w:numFmt w:val="bullet"/>
+      <w:lvlText w:val=""/>
+      <w:lvlJc w:val="left"/>
+      <w:pPr>
+        <w:ind w:left="2160" w:hanging="360"/>
+      </w:pPr>
+      <w:rPr>
+        <w:rFonts w:ascii="Wingdings" w:hAnsi="Wingdings" w:hint="default"/>
+      </w:rPr>
+    </w:lvl>
+    <w:lvl w:ilvl="3" w:tplc="04090001" w:tentative="1">
+      <w:start w:val="1"/>
+      <w:numFmt w:val="bullet"/>
+      <w:lvlText w:val=""/>
+      <w:lvlJc w:val="left"/>
+      <w:pPr>
+        <w:ind w:left="2880" w:hanging="360"/>
+      </w:pPr>
+      <w:rPr>
+        <w:rFonts w:ascii="Symbol" w:hAnsi="Symbol" w:hint="default"/>
+      </w:rPr>
+    </w:lvl>
+    <w:lvl w:ilvl="4" w:tplc="04090003" w:tentative="1">
+      <w:start w:val="1"/>
+      <w:numFmt w:val="bullet"/>
+      <w:lvlText w:val="o"/>
+      <w:lvlJc w:val="left"/>
+      <w:pPr>
+        <w:ind w:left="3600" w:hanging="360"/>
+      </w:pPr>
+      <w:rPr>
+        <w:rFonts w:ascii="Courier New" w:hAnsi="Courier New" w:cs="Courier New" w:hint="default"/>
+      </w:rPr>
+    </w:lvl>
+    <w:lvl w:ilvl="5" w:tplc="04090005" w:tentative="1">
+      <w:start w:val="1"/>
+      <w:numFmt w:val="bullet"/>
+      <w:lvlText w:val=""/>
+      <w:lvlJc w:val="left"/>
+      <w:pPr>
+        <w:ind w:left="4320" w:hanging="360"/>
+      </w:pPr>
+      <w:rPr>
+        <w:rFonts w:ascii="Wingdings" w:hAnsi="Wingdings" w:hint="default"/>
+      </w:rPr>
+    </w:lvl>
+    <w:lvl w:ilvl="6" w:tplc="04090001" w:tentative="1">
+      <w:start w:val="1"/>
+      <w:numFmt w:val="bullet"/>
+      <w:lvlText w:val=""/>
+      <w:lvlJc w:val="left"/>
+      <w:pPr>
+        <w:ind w:left="5040" w:hanging="360"/>
+      </w:pPr>
+      <w:rPr>
+        <w:rFonts w:ascii="Symbol" w:hAnsi="Symbol" w:hint="default"/>
+      </w:rPr>
+    </w:lvl>
+    <w:lvl w:ilvl="7" w:tplc="04090003" w:tentative="1">
+      <w:start w:val="1"/>
+      <w:numFmt w:val="bullet"/>
+      <w:lvlText w:val="o"/>
+      <w:lvlJc w:val="left"/>
+      <w:pPr>
+        <w:ind w:left="5760" w:hanging="360"/>
+      </w:pPr>
+      <w:rPr>
+        <w:rFonts w:ascii="Courier New" w:hAnsi="Courier New" w:cs="Courier New" w:hint="default"/>
+      </w:rPr>
+    </w:lvl>
+    <w:lvl w:ilvl="8" w:tplc="04090005" w:tentative="1">
+      <w:start w:val="1"/>
+      <w:numFmt w:val="bullet"/>
+      <w:lvlText w:val=""/>
+      <w:lvlJc w:val="left"/>
+      <w:pPr>
+        <w:ind w:left="6480" w:hanging="360"/>
+      </w:pPr>
+      <w:rPr>
+        <w:rFonts w:ascii="Wingdings" w:hAnsi="Wingdings" w:hint="default"/>
+      </w:rPr>
+    </w:lvl>
+  </w:abstractNum>
+  <w:abstractNum w:abstractNumId="10" w15:restartNumberingAfterBreak="0">
+    <w:nsid w:val="21F31746"/>
+    <w:multiLevelType w:val="hybridMultilevel"/>
+    <w:tmpl w:val="AD762ACA"/>
+    <w:lvl w:ilvl="0" w:tplc="04090015">
+      <w:start w:val="1"/>
+      <w:numFmt w:val="upperLetter"/>
+      <w:lvlText w:val="%1."/>
+      <w:lvlJc w:val="left"/>
+      <w:pPr>
+        <w:ind w:left="720" w:hanging="360"/>
+      </w:pPr>
+      <w:rPr>
+        <w:rFonts w:hint="default"/>
+      </w:rPr>
+    </w:lvl>
+    <w:lvl w:ilvl="1" w:tplc="04090019">
+      <w:start w:val="1"/>
+      <w:numFmt w:val="lowerLetter"/>
+      <w:lvlText w:val="%2."/>
+      <w:lvlJc w:val="left"/>
+      <w:pPr>
+        <w:ind w:left="1440" w:hanging="360"/>
+      </w:pPr>
+    </w:lvl>
+    <w:lvl w:ilvl="2" w:tplc="0409001B" w:tentative="1">
+      <w:start w:val="1"/>
+      <w:numFmt w:val="lowerRoman"/>
+      <w:lvlText w:val="%3."/>
+      <w:lvlJc w:val="right"/>
+      <w:pPr>
+        <w:ind w:left="2160" w:hanging="180"/>
+      </w:pPr>
+    </w:lvl>
+    <w:lvl w:ilvl="3" w:tplc="0409000F" w:tentative="1">
+      <w:start w:val="1"/>
+      <w:numFmt w:val="decimal"/>
+      <w:lvlText w:val="%4."/>
+      <w:lvlJc w:val="left"/>
+      <w:pPr>
+        <w:ind w:left="2880" w:hanging="360"/>
+      </w:pPr>
+    </w:lvl>
+    <w:lvl w:ilvl="4" w:tplc="04090019" w:tentative="1">
+      <w:start w:val="1"/>
+      <w:numFmt w:val="lowerLetter"/>
+      <w:lvlText w:val="%5."/>
+      <w:lvlJc w:val="left"/>
+      <w:pPr>
+        <w:ind w:left="3600" w:hanging="360"/>
+      </w:pPr>
+    </w:lvl>
+    <w:lvl w:ilvl="5" w:tplc="0409001B" w:tentative="1">
+      <w:start w:val="1"/>
+      <w:numFmt w:val="lowerRoman"/>
+      <w:lvlText w:val="%6."/>
+      <w:lvlJc w:val="right"/>
+      <w:pPr>
+        <w:ind w:left="4320" w:hanging="180"/>
+      </w:pPr>
+    </w:lvl>
+    <w:lvl w:ilvl="6" w:tplc="0409000F" w:tentative="1">
+      <w:start w:val="1"/>
+      <w:numFmt w:val="decimal"/>
+      <w:lvlText w:val="%7."/>
+      <w:lvlJc w:val="left"/>
+      <w:pPr>
+        <w:ind w:left="5040" w:hanging="360"/>
+      </w:pPr>
+    </w:lvl>
+    <w:lvl w:ilvl="7" w:tplc="04090019" w:tentative="1">
+      <w:start w:val="1"/>
+      <w:numFmt w:val="lowerLetter"/>
+      <w:lvlText w:val="%8."/>
+      <w:lvlJc w:val="left"/>
+      <w:pPr>
+        <w:ind w:left="5760" w:hanging="360"/>
+      </w:pPr>
+    </w:lvl>
+    <w:lvl w:ilvl="8" w:tplc="0409001B" w:tentative="1">
+      <w:start w:val="1"/>
+      <w:numFmt w:val="lowerRoman"/>
+      <w:lvlText w:val="%9."/>
+      <w:lvlJc w:val="right"/>
+      <w:pPr>
+        <w:ind w:left="6480" w:hanging="180"/>
+      </w:pPr>
+    </w:lvl>
+  </w:abstractNum>
+  <w:abstractNum w:abstractNumId="11" w15:restartNumberingAfterBreak="0">
+    <w:nsid w:val="36C73B61"/>
+    <w:multiLevelType w:val="hybridMultilevel"/>
+    <w:tmpl w:val="6B1A26DA"/>
+    <w:lvl w:ilvl="0" w:tplc="0409000F">
+      <w:start w:val="1"/>
+      <w:numFmt w:val="decimal"/>
+      <w:lvlText w:val="%1."/>
+      <w:lvlJc w:val="left"/>
+      <w:pPr>
+        <w:ind w:left="720" w:hanging="360"/>
+      </w:pPr>
+      <w:rPr>
+        <w:rFonts w:hint="default"/>
+      </w:rPr>
+    </w:lvl>
+    <w:lvl w:ilvl="1" w:tplc="04090019" w:tentative="1">
+      <w:start w:val="1"/>
+      <w:numFmt w:val="lowerLetter"/>
+      <w:lvlText w:val="%2."/>
+      <w:lvlJc w:val="left"/>
+      <w:pPr>
+        <w:ind w:left="1440" w:hanging="360"/>
+      </w:pPr>
+    </w:lvl>
+    <w:lvl w:ilvl="2" w:tplc="0409001B" w:tentative="1">
+      <w:start w:val="1"/>
+      <w:numFmt w:val="lowerRoman"/>
+      <w:lvlText w:val="%3."/>
+      <w:lvlJc w:val="right"/>
+      <w:pPr>
+        <w:ind w:left="2160" w:hanging="180"/>
+      </w:pPr>
+    </w:lvl>
+    <w:lvl w:ilvl="3" w:tplc="0409000F" w:tentative="1">
+      <w:start w:val="1"/>
+      <w:numFmt w:val="decimal"/>
+      <w:lvlText w:val="%4."/>
+      <w:lvlJc w:val="left"/>
+      <w:pPr>
+        <w:ind w:left="2880" w:hanging="360"/>
+      </w:pPr>
+    </w:lvl>
+    <w:lvl w:ilvl="4" w:tplc="04090019" w:tentative="1">
+      <w:start w:val="1"/>
+      <w:numFmt w:val="lowerLetter"/>
+      <w:lvlText w:val="%5."/>
+      <w:lvlJc w:val="left"/>
+      <w:pPr>
+        <w:ind w:left="3600" w:hanging="360"/>
+      </w:pPr>
+    </w:lvl>
+    <w:lvl w:ilvl="5" w:tplc="0409001B" w:tentative="1">
+      <w:start w:val="1"/>
+      <w:numFmt w:val="lowerRoman"/>
+      <w:lvlText w:val="%6."/>
+      <w:lvlJc w:val="right"/>
+      <w:pPr>
+        <w:ind w:left="4320" w:hanging="180"/>
+      </w:pPr>
+    </w:lvl>
+    <w:lvl w:ilvl="6" w:tplc="0409000F" w:tentative="1">
+      <w:start w:val="1"/>
+      <w:numFmt w:val="decimal"/>
+      <w:lvlText w:val="%7."/>
+      <w:lvlJc w:val="left"/>
+      <w:pPr>
+        <w:ind w:left="5040" w:hanging="360"/>
+      </w:pPr>
+    </w:lvl>
+    <w:lvl w:ilvl="7" w:tplc="04090019" w:tentative="1">
+      <w:start w:val="1"/>
+      <w:numFmt w:val="lowerLetter"/>
+      <w:lvlText w:val="%8."/>
+      <w:lvlJc w:val="left"/>
+      <w:pPr>
+        <w:ind w:left="5760" w:hanging="360"/>
+      </w:pPr>
+    </w:lvl>
+    <w:lvl w:ilvl="8" w:tplc="0409001B" w:tentative="1">
+      <w:start w:val="1"/>
+      <w:numFmt w:val="lowerRoman"/>
+      <w:lvlText w:val="%9."/>
+      <w:lvlJc w:val="right"/>
+      <w:pPr>
+        <w:ind w:left="6480" w:hanging="180"/>
+      </w:pPr>
+    </w:lvl>
+  </w:abstractNum>
+  <w:abstractNum w:abstractNumId="12" w15:restartNumberingAfterBreak="0">
+    <w:nsid w:val="5D206C0A"/>
+    <w:multiLevelType w:val="hybridMultilevel"/>
+    <w:tmpl w:val="7B2E1A24"/>
+    <w:lvl w:ilvl="0" w:tplc="04090015">
+      <w:start w:val="1"/>
+      <w:numFmt w:val="upperLetter"/>
+      <w:lvlText w:val="%1."/>
+      <w:lvlJc w:val="left"/>
+      <w:pPr>
+        <w:ind w:left="720" w:hanging="360"/>
+      </w:pPr>
+      <w:rPr>
+        <w:rFonts w:hint="default"/>
+      </w:rPr>
+    </w:lvl>
+    <w:lvl w:ilvl="1" w:tplc="04090019" w:tentative="1">
+      <w:start w:val="1"/>
+      <w:numFmt w:val="lowerLetter"/>
+      <w:lvlText w:val="%2."/>
+      <w:lvlJc w:val="left"/>
+      <w:pPr>
+        <w:ind w:left="1440" w:hanging="360"/>
+      </w:pPr>
+    </w:lvl>
+    <w:lvl w:ilvl="2" w:tplc="0409001B" w:tentative="1">
+      <w:start w:val="1"/>
+      <w:numFmt w:val="lowerRoman"/>
+      <w:lvlText w:val="%3."/>
+      <w:lvlJc w:val="right"/>
+      <w:pPr>
+        <w:ind w:left="2160" w:hanging="180"/>
+      </w:pPr>
+    </w:lvl>
+    <w:lvl w:ilvl="3" w:tplc="0409000F" w:tentative="1">
+      <w:start w:val="1"/>
+      <w:numFmt w:val="decimal"/>
+      <w:lvlText w:val="%4."/>
+      <w:lvlJc w:val="left"/>
+      <w:pPr>
+        <w:ind w:left="2880" w:hanging="360"/>
+      </w:pPr>
+    </w:lvl>
+    <w:lvl w:ilvl="4" w:tplc="04090019" w:tentative="1">
+      <w:start w:val="1"/>
+      <w:numFmt w:val="lowerLetter"/>
+      <w:lvlText w:val="%5."/>
+      <w:lvlJc w:val="left"/>
+      <w:pPr>
+        <w:ind w:left="3600" w:hanging="360"/>
+      </w:pPr>
+    </w:lvl>
+    <w:lvl w:ilvl="5" w:tplc="0409001B" w:tentative="1">
+      <w:start w:val="1"/>
+      <w:numFmt w:val="lowerRoman"/>
+      <w:lvlText w:val="%6."/>
+      <w:lvlJc w:val="right"/>
+      <w:pPr>
+        <w:ind w:left="4320" w:hanging="180"/>
+      </w:pPr>
+    </w:lvl>
+    <w:lvl w:ilvl="6" w:tplc="0409000F" w:tentative="1">
+      <w:start w:val="1"/>
+      <w:numFmt w:val="decimal"/>
+      <w:lvlText w:val="%7."/>
+      <w:lvlJc w:val="left"/>
+      <w:pPr>
+        <w:ind w:left="5040" w:hanging="360"/>
+      </w:pPr>
+    </w:lvl>
+    <w:lvl w:ilvl="7" w:tplc="04090019" w:tentative="1">
+      <w:start w:val="1"/>
+      <w:numFmt w:val="lowerLetter"/>
+      <w:lvlText w:val="%8."/>
+      <w:lvlJc w:val="left"/>
+      <w:pPr>
+        <w:ind w:left="5760" w:hanging="360"/>
+      </w:pPr>
+    </w:lvl>
+    <w:lvl w:ilvl="8" w:tplc="0409001B" w:tentative="1">
+      <w:start w:val="1"/>
+      <w:numFmt w:val="lowerRoman"/>
+      <w:lvlText w:val="%9."/>
+      <w:lvlJc w:val="right"/>
+      <w:pPr>
+        <w:ind w:left="6480" w:hanging="180"/>
+      </w:pPr>
     </w:lvl>
   </w:abstractNum>
   <w:num w:numId="1" w16cid:durableId="436877743">
@@ -1921,6 +2225,18 @@
   </w:num>
   <w:num w:numId="9" w16cid:durableId="428887458">
     <w:abstractNumId w:val="0"/>
+  </w:num>
+  <w:num w:numId="10" w16cid:durableId="1550845009">
+    <w:abstractNumId w:val="11"/>
+  </w:num>
+  <w:num w:numId="11" w16cid:durableId="1894996145">
+    <w:abstractNumId w:val="12"/>
+  </w:num>
+  <w:num w:numId="12" w16cid:durableId="1301304120">
+    <w:abstractNumId w:val="10"/>
+  </w:num>
+  <w:num w:numId="13" w16cid:durableId="840504107">
+    <w:abstractNumId w:val="9"/>
   </w:num>
 </w:numbering>
 </file>
@@ -13308,6 +13624,29 @@
       </w:tcPr>
     </w:tblStylePr>
   </w:style>
+  <w:style w:type="character" w:styleId="Siuktni">
+    <w:name w:val="Hyperlink"/>
+    <w:basedOn w:val="Phngmcinhcuaoanvn"/>
+    <w:uiPriority w:val="99"/>
+    <w:unhideWhenUsed/>
+    <w:rsid w:val="00043FC0"/>
+    <w:rPr>
+      <w:color w:val="0000FF" w:themeColor="hyperlink"/>
+      <w:u w:val="single"/>
+    </w:rPr>
+  </w:style>
+  <w:style w:type="character" w:styleId="cpChagiiquyt">
+    <w:name w:val="Unresolved Mention"/>
+    <w:basedOn w:val="Phngmcinhcuaoanvn"/>
+    <w:uiPriority w:val="99"/>
+    <w:semiHidden/>
+    <w:unhideWhenUsed/>
+    <w:rsid w:val="00043FC0"/>
+    <w:rPr>
+      <w:color w:val="605E5C"/>
+      <w:shd w:val="clear" w:color="auto" w:fill="E1DFDD"/>
+    </w:rPr>
+  </w:style>
 </w:styles>
 </file>
 

</xml_diff>